<commit_message>
Agregar enlace del repositorio al documento tecnico
</commit_message>
<xml_diff>
--- a/docs/DocumentoTecnico.docx
+++ b/docs/DocumentoTecnico.docx
@@ -61,7 +61,8 @@
     <w:tbl>
       <w:tblPr>
         <w:tblStyle w:val="Table"/>
-        <w:tblW w:type="auto" w:w="0"/>
+        <w:tblW w:type="pct" w:w="5000"/>
+        <w:tblLayout w:type="fixed"/>
         <w:tblLook w:firstRow="0" w:lastRow="0" w:firstColumn="0" w:lastColumn="0" w:noHBand="0" w:noVBand="0" w:val="0000"/>
       </w:tblPr>
       <w:tblGrid>
@@ -176,6 +177,34 @@
             </w:pPr>
             <w:r>
               <w:t xml:space="preserve">Worker Service — .NET 8</w:t>
+            </w:r>
+          </w:p>
+        </w:tc>
+      </w:tr>
+      <w:tr>
+        <w:tc>
+          <w:tcPr/>
+          <w:p>
+            <w:pPr>
+              <w:pStyle w:val="Compact"/>
+            </w:pPr>
+            <w:r>
+              <w:rPr>
+                <w:b/>
+                <w:bCs/>
+              </w:rPr>
+              <w:t xml:space="preserve">Repositorio</w:t>
+            </w:r>
+          </w:p>
+        </w:tc>
+        <w:tc>
+          <w:tcPr/>
+          <w:p>
+            <w:pPr>
+              <w:pStyle w:val="Compact"/>
+            </w:pPr>
+            <w:r>
+              <w:t xml:space="preserve">https://github.com/MarioMahir/-SistemaAnalisisOpiniones</w:t>
             </w:r>
           </w:p>
         </w:tc>
@@ -2864,6 +2893,14 @@
       </w:pPr>
       <w:r>
         <w:t xml:space="preserve">8. Ejecución del proyecto</w:t>
+      </w:r>
+    </w:p>
+    <w:p>
+      <w:pPr>
+        <w:pStyle w:val="FirstParagraph"/>
+      </w:pPr>
+      <w:r>
+        <w:t xml:space="preserve">El código fuente completo está disponible en el repositorio de GitHub: https://github.com/MarioMahir/-SistemaAnalisisOpiniones</w:t>
       </w:r>
     </w:p>
     <w:p>

</xml_diff>

<commit_message>
Aplicar formato institucional con portada a los documentos de entrega
</commit_message>
<xml_diff>
--- a/docs/DocumentoTecnico.docx
+++ b/docs/DocumentoTecnico.docx
@@ -2,435 +2,27 @@
 <file path=word/document.xml><?xml version="1.0" encoding="utf-8"?>
 <w:document xmlns:w="http://schemas.openxmlformats.org/wordprocessingml/2006/main" xmlns:m="http://schemas.openxmlformats.org/officeDocument/2006/math" xmlns:r="http://schemas.openxmlformats.org/officeDocument/2006/relationships" xmlns:o="urn:schemas-microsoft-com:office:office" xmlns:v="urn:schemas-microsoft-com:vml" xmlns:w10="urn:schemas-microsoft-com:office:word" xmlns:a="http://schemas.openxmlformats.org/drawingml/2006/main" xmlns:pic="http://schemas.openxmlformats.org/drawingml/2006/picture" xmlns:wp="http://schemas.openxmlformats.org/drawingml/2006/wordprocessingDrawing">
   <w:body>
-    <w:sdt>
-      <w:sdtPr>
-        <w:docPartObj>
-          <w:docPartGallery w:val="Table of Contents"/>
-          <w:docPartUnique/>
-        </w:docPartObj>
-      </w:sdtPr>
-      <w:sdtContent>
-        <w:p>
-          <w:pPr>
-            <w:pStyle w:val="TOCHeading"/>
-          </w:pPr>
-          <w:r>
-            <w:t xml:space="preserve">Table of Contents</w:t>
-          </w:r>
-        </w:p>
-        <w:p>
-          <w:r>
-            <w:fldChar w:fldCharType="begin" w:dirty="true"/>
-            <w:instrText xml:space="preserve">TOC \o "1-2" \h \z \u</w:instrText>
-            <w:fldChar w:fldCharType="separate"/>
-            <w:fldChar w:fldCharType="end"/>
-          </w:r>
-        </w:p>
-      </w:sdtContent>
-    </w:sdt>
-    <w:bookmarkStart w:id="32" w:name="documento-técnico"/>
-    <w:p>
-      <w:pPr>
-        <w:pStyle w:val="Heading1"/>
-      </w:pPr>
-      <w:r>
-        <w:t xml:space="preserve">Documento Técnico</w:t>
-      </w:r>
-    </w:p>
-    <w:bookmarkStart w:id="9" w:name="X7af15bef8924b4eb641ccdc4c8df27893c51915"/>
-    <w:p>
-      <w:pPr>
-        <w:pStyle w:val="Heading2"/>
-      </w:pPr>
-      <w:r>
-        <w:t xml:space="preserve">Creación de la Arquitectura y Desarrollo del Proceso de Extracción</w:t>
-      </w:r>
-    </w:p>
     <w:p>
       <w:pPr>
         <w:pStyle w:val="FirstParagraph"/>
-      </w:pPr>
-      <w:r>
-        <w:rPr>
-          <w:b/>
-          <w:bCs/>
-        </w:rPr>
-        <w:t xml:space="preserve">Sistema de Análisis de Opiniones de Clientes</w:t>
-      </w:r>
-    </w:p>
-    <w:tbl>
-      <w:tblPr>
-        <w:tblStyle w:val="Table"/>
-        <w:tblW w:type="pct" w:w="5000"/>
-        <w:tblLayout w:type="fixed"/>
-        <w:tblLook w:firstRow="0" w:lastRow="0" w:firstColumn="0" w:lastColumn="0" w:noHBand="0" w:noVBand="0" w:val="0000"/>
-      </w:tblPr>
-      <w:tblGrid>
-        <w:gridCol w:w="3960"/>
-        <w:gridCol w:w="3960"/>
-      </w:tblGrid>
-      <w:tr>
-        <w:tc>
-          <w:tcPr/>
-          <w:p>
-            <w:pPr>
-              <w:pStyle w:val="Compact"/>
-            </w:pPr>
-            <w:r>
-              <w:rPr>
-                <w:b/>
-                <w:bCs/>
-              </w:rPr>
-              <w:t xml:space="preserve">Estudiante</w:t>
-            </w:r>
-          </w:p>
-        </w:tc>
-        <w:tc>
-          <w:tcPr/>
-          <w:p>
-            <w:pPr>
-              <w:pStyle w:val="Compact"/>
-            </w:pPr>
-            <w:r>
-              <w:t xml:space="preserve">Mario Sabala</w:t>
-            </w:r>
-          </w:p>
-        </w:tc>
-      </w:tr>
-      <w:tr>
-        <w:tc>
-          <w:tcPr/>
-          <w:p>
-            <w:pPr>
-              <w:pStyle w:val="Compact"/>
-            </w:pPr>
-            <w:r>
-              <w:rPr>
-                <w:b/>
-                <w:bCs/>
-              </w:rPr>
-              <w:t xml:space="preserve">Matrícula</w:t>
-            </w:r>
-          </w:p>
-        </w:tc>
-        <w:tc>
-          <w:tcPr/>
-          <w:p>
-            <w:pPr>
-              <w:pStyle w:val="Compact"/>
-            </w:pPr>
-            <w:r>
-              <w:t xml:space="preserve">2025-1035</w:t>
-            </w:r>
-          </w:p>
-        </w:tc>
-      </w:tr>
-      <w:tr>
-        <w:tc>
-          <w:tcPr/>
-          <w:p>
-            <w:pPr>
-              <w:pStyle w:val="Compact"/>
-            </w:pPr>
-            <w:r>
-              <w:rPr>
-                <w:b/>
-                <w:bCs/>
-              </w:rPr>
-              <w:t xml:space="preserve">Fecha</w:t>
-            </w:r>
-          </w:p>
-        </w:tc>
-        <w:tc>
-          <w:tcPr/>
-          <w:p>
-            <w:pPr>
-              <w:pStyle w:val="Compact"/>
-            </w:pPr>
-            <w:r>
-              <w:t xml:space="preserve">Agosto 2026</w:t>
-            </w:r>
-          </w:p>
-        </w:tc>
-      </w:tr>
-      <w:tr>
-        <w:tc>
-          <w:tcPr/>
-          <w:p>
-            <w:pPr>
-              <w:pStyle w:val="Compact"/>
-            </w:pPr>
-            <w:r>
-              <w:rPr>
-                <w:b/>
-                <w:bCs/>
-              </w:rPr>
-              <w:t xml:space="preserve">Tecnología</w:t>
-            </w:r>
-          </w:p>
-        </w:tc>
-        <w:tc>
-          <w:tcPr/>
-          <w:p>
-            <w:pPr>
-              <w:pStyle w:val="Compact"/>
-            </w:pPr>
-            <w:r>
-              <w:t xml:space="preserve">Worker Service — .NET 8</w:t>
-            </w:r>
-          </w:p>
-        </w:tc>
-      </w:tr>
-      <w:tr>
-        <w:tc>
-          <w:tcPr/>
-          <w:p>
-            <w:pPr>
-              <w:pStyle w:val="Compact"/>
-            </w:pPr>
-            <w:r>
-              <w:rPr>
-                <w:b/>
-                <w:bCs/>
-              </w:rPr>
-              <w:t xml:space="preserve">Repositorio</w:t>
-            </w:r>
-          </w:p>
-        </w:tc>
-        <w:tc>
-          <w:tcPr/>
-          <w:p>
-            <w:pPr>
-              <w:pStyle w:val="Compact"/>
-            </w:pPr>
-            <w:r>
-              <w:t xml:space="preserve">https://github.com/MarioMahir/-SistemaAnalisisOpiniones</w:t>
-            </w:r>
-          </w:p>
-        </w:tc>
-      </w:tr>
-    </w:tbl>
-    <w:p>
-      <w:r>
-        <w:pict>
-          <v:rect style="width:0;height:1.5pt" o:hralign="center" o:hrstd="t" o:hr="t"/>
-        </w:pict>
-      </w:r>
-    </w:p>
-    <w:bookmarkEnd w:id="9"/>
-    <w:bookmarkStart w:id="10" w:name="introducción"/>
-    <w:p>
-      <w:pPr>
-        <w:pStyle w:val="Heading2"/>
-      </w:pPr>
-      <w:r>
-        <w:t xml:space="preserve">1. Introducción</w:t>
-      </w:r>
-    </w:p>
-    <w:p>
-      <w:pPr>
-        <w:pStyle w:val="FirstParagraph"/>
-      </w:pPr>
-      <w:r>
-        <w:t xml:space="preserve">Este documento describe la arquitectura y la implementación del proceso de</w:t>
-      </w:r>
-      <w:r>
-        <w:t xml:space="preserve"> </w:t>
-      </w:r>
-      <w:r>
-        <w:rPr>
-          <w:b/>
-          <w:bCs/>
-        </w:rPr>
-        <w:t xml:space="preserve">extracción (E de ETL)</w:t>
-      </w:r>
-      <w:r>
-        <w:t xml:space="preserve"> </w:t>
-      </w:r>
-      <w:r>
-        <w:t xml:space="preserve">del Sistema de Análisis de Opiniones de Clientes. El sistema consolida opiniones que llegan por tres canales heterogéneos:</w:t>
-      </w:r>
-    </w:p>
-    <w:p>
-      <w:pPr>
-        <w:pStyle w:val="Compact"/>
-        <w:numPr>
-          <w:ilvl w:val="0"/>
-          <w:numId w:val="1001"/>
-        </w:numPr>
-      </w:pPr>
-      <w:r>
-        <w:rPr>
-          <w:b/>
-          <w:bCs/>
-        </w:rPr>
-        <w:t xml:space="preserve">Archivos CSV</w:t>
-      </w:r>
-      <w:r>
-        <w:t xml:space="preserve"> </w:t>
-      </w:r>
-      <w:r>
-        <w:t xml:space="preserve">— encuestas internas de satisfacción y catálogos (clientes, productos, fuentes de dato).</w:t>
-      </w:r>
-    </w:p>
-    <w:p>
-      <w:pPr>
-        <w:pStyle w:val="Compact"/>
-        <w:numPr>
-          <w:ilvl w:val="0"/>
-          <w:numId w:val="1001"/>
-        </w:numPr>
-      </w:pPr>
-      <w:r>
-        <w:rPr>
-          <w:b/>
-          <w:bCs/>
-        </w:rPr>
-        <w:t xml:space="preserve">Base de datos relacional</w:t>
-      </w:r>
-      <w:r>
-        <w:t xml:space="preserve"> </w:t>
-      </w:r>
-      <w:r>
-        <w:t xml:space="preserve">(</w:t>
-      </w:r>
-      <w:r>
-        <w:rPr>
-          <w:rStyle w:val="VerbatimChar"/>
-        </w:rPr>
-        <w:t xml:space="preserve">TiendaWebOrigen</w:t>
-      </w:r>
-      <w:r>
-        <w:t xml:space="preserve">) — reseñas publicadas en el sitio web de la tienda.</w:t>
-      </w:r>
-    </w:p>
-    <w:p>
-      <w:pPr>
-        <w:pStyle w:val="Compact"/>
-        <w:numPr>
-          <w:ilvl w:val="0"/>
-          <w:numId w:val="1001"/>
-        </w:numPr>
-      </w:pPr>
-      <w:r>
-        <w:rPr>
-          <w:b/>
-          <w:bCs/>
-        </w:rPr>
-        <w:t xml:space="preserve">API REST</w:t>
-      </w:r>
-      <w:r>
-        <w:t xml:space="preserve"> </w:t>
-      </w:r>
-      <w:r>
-        <w:t xml:space="preserve">(</w:t>
-      </w:r>
-      <w:r>
-        <w:rPr>
-          <w:rStyle w:val="VerbatimChar"/>
-        </w:rPr>
-        <w:t xml:space="preserve">TiendaSocialApi</w:t>
-      </w:r>
-      <w:r>
-        <w:t xml:space="preserve">) — comentarios de redes sociales.</w:t>
-      </w:r>
-    </w:p>
-    <w:p>
-      <w:pPr>
-        <w:pStyle w:val="FirstParagraph"/>
-      </w:pPr>
-      <w:r>
-        <w:t xml:space="preserve">El proceso se implementó como un</w:t>
-      </w:r>
-      <w:r>
-        <w:t xml:space="preserve"> </w:t>
-      </w:r>
-      <w:r>
-        <w:rPr>
-          <w:b/>
-          <w:bCs/>
-        </w:rPr>
-        <w:t xml:space="preserve">Worker Service en .NET 8</w:t>
-      </w:r>
-      <w:r>
-        <w:t xml:space="preserve"> </w:t>
-      </w:r>
-      <w:r>
-        <w:t xml:space="preserve">que extrae de las tres fuentes</w:t>
-      </w:r>
-      <w:r>
-        <w:t xml:space="preserve"> </w:t>
-      </w:r>
-      <w:r>
-        <w:rPr>
-          <w:b/>
-          <w:bCs/>
-        </w:rPr>
-        <w:t xml:space="preserve">en paralelo</w:t>
-      </w:r>
-      <w:r>
-        <w:t xml:space="preserve">, valida los registros y los guarda en las tablas de</w:t>
-      </w:r>
-      <w:r>
-        <w:t xml:space="preserve"> </w:t>
-      </w:r>
-      <w:r>
-        <w:rPr>
-          <w:i/>
-          <w:iCs/>
-        </w:rPr>
-        <w:t xml:space="preserve">staging</w:t>
-      </w:r>
-      <w:r>
-        <w:t xml:space="preserve"> </w:t>
-      </w:r>
-      <w:r>
-        <w:t xml:space="preserve">de la base de datos</w:t>
-      </w:r>
-      <w:r>
-        <w:t xml:space="preserve"> </w:t>
-      </w:r>
-      <w:r>
-        <w:rPr>
-          <w:rStyle w:val="VerbatimChar"/>
-        </w:rPr>
-        <w:t xml:space="preserve">SistemaAnalisisOpiniones</w:t>
-      </w:r>
-      <w:r>
-        <w:t xml:space="preserve">.</w:t>
-      </w:r>
-    </w:p>
-    <w:bookmarkEnd w:id="10"/>
-    <w:bookmarkStart w:id="14" w:name="diagrama-de-arquitectura"/>
-    <w:p>
-      <w:pPr>
-        <w:pStyle w:val="Heading2"/>
-      </w:pPr>
-      <w:r>
-        <w:t xml:space="preserve">2. Diagrama de arquitectura</w:t>
-      </w:r>
-    </w:p>
-    <w:p>
-      <w:pPr>
-        <w:pStyle w:val="CaptionedFigure"/>
       </w:pPr>
       <w:r>
         <w:drawing>
           <wp:inline>
-            <wp:extent cx="5334000" cy="2381250"/>
+            <wp:extent cx="4736592" cy="1788481"/>
             <wp:effectExtent b="0" l="0" r="0" t="0"/>
-            <wp:docPr descr="Diagrama de arquitectura" title="" id="12" name="Picture"/>
+            <wp:docPr descr="" title="" id="19" name="Picture"/>
             <a:graphic>
               <a:graphicData uri="http://schemas.openxmlformats.org/drawingml/2006/picture">
                 <pic:pic>
                   <pic:nvPicPr>
-                    <pic:cNvPr descr="diagramas/arquitectura.png" id="13" name="Picture"/>
+                    <pic:cNvPr descr="diagramas/logo_itla.png" id="20" name="Picture"/>
                     <pic:cNvPicPr>
                       <a:picLocks noChangeArrowheads="1" noChangeAspect="1"/>
                     </pic:cNvPicPr>
                   </pic:nvPicPr>
                   <pic:blipFill>
-                    <a:blip r:embed="rId11"/>
+                    <a:blip r:embed="rId18"/>
                     <a:stretch>
                       <a:fillRect/>
                     </a:stretch>
@@ -438,7 +30,427 @@
                   <pic:spPr bwMode="auto">
                     <a:xfrm>
                       <a:off x="0" y="0"/>
-                      <a:ext cx="5334000" cy="2381250"/>
+                      <a:ext cx="4736592" cy="1788481"/>
+                    </a:xfrm>
+                    <a:prstGeom prst="rect">
+                      <a:avLst/>
+                    </a:prstGeom>
+                    <a:noFill/>
+                    <a:ln w="9525">
+                      <a:noFill/>
+                      <a:headEnd/>
+                      <a:tailEnd/>
+                    </a:ln>
+                  </pic:spPr>
+                </pic:pic>
+              </a:graphicData>
+            </a:graphic>
+          </wp:inline>
+        </w:drawing>
+      </w:r>
+    </w:p>
+    <w:p>
+      <w:pPr>
+        <w:pStyle w:val="BodyText"/>
+      </w:pPr>
+      <w:r>
+        <w:rPr>
+          <w:b/>
+          <w:bCs/>
+        </w:rPr>
+        <w:t xml:space="preserve">Presentación</w:t>
+      </w:r>
+    </w:p>
+    <w:p>
+      <w:pPr>
+        <w:pStyle w:val="BodyText"/>
+      </w:pPr>
+      <w:r>
+        <w:rPr>
+          <w:b/>
+          <w:bCs/>
+        </w:rPr>
+        <w:t xml:space="preserve">Nombres:</w:t>
+      </w:r>
+      <w:r>
+        <w:t xml:space="preserve"> </w:t>
+      </w:r>
+      <w:r>
+        <w:t xml:space="preserve">Mario Alejandro</w:t>
+      </w:r>
+    </w:p>
+    <w:p>
+      <w:pPr>
+        <w:pStyle w:val="BodyText"/>
+      </w:pPr>
+      <w:r>
+        <w:rPr>
+          <w:b/>
+          <w:bCs/>
+        </w:rPr>
+        <w:t xml:space="preserve">Apellidos:</w:t>
+      </w:r>
+      <w:r>
+        <w:t xml:space="preserve"> </w:t>
+      </w:r>
+      <w:r>
+        <w:t xml:space="preserve">Sabala Encarnación</w:t>
+      </w:r>
+    </w:p>
+    <w:p>
+      <w:pPr>
+        <w:pStyle w:val="BodyText"/>
+      </w:pPr>
+      <w:r>
+        <w:rPr>
+          <w:b/>
+          <w:bCs/>
+        </w:rPr>
+        <w:t xml:space="preserve">Matrícula:</w:t>
+      </w:r>
+      <w:r>
+        <w:t xml:space="preserve"> </w:t>
+      </w:r>
+      <w:r>
+        <w:t xml:space="preserve">2025-1035</w:t>
+      </w:r>
+    </w:p>
+    <w:p>
+      <w:pPr>
+        <w:pStyle w:val="BodyText"/>
+      </w:pPr>
+      <w:r>
+        <w:rPr>
+          <w:b/>
+          <w:bCs/>
+        </w:rPr>
+        <w:t xml:space="preserve">Carrera:</w:t>
+      </w:r>
+      <w:r>
+        <w:t xml:space="preserve"> </w:t>
+      </w:r>
+      <w:r>
+        <w:t xml:space="preserve">Desarrollo de Software</w:t>
+      </w:r>
+    </w:p>
+    <w:p>
+      <w:pPr>
+        <w:pStyle w:val="BodyText"/>
+      </w:pPr>
+      <w:r>
+        <w:rPr>
+          <w:b/>
+          <w:bCs/>
+        </w:rPr>
+        <w:t xml:space="preserve">Materia:</w:t>
+      </w:r>
+      <w:r>
+        <w:t xml:space="preserve"> </w:t>
+      </w:r>
+      <w:r>
+        <w:t xml:space="preserve">Big Data</w:t>
+      </w:r>
+    </w:p>
+    <w:p>
+      <w:pPr>
+        <w:pStyle w:val="BodyText"/>
+      </w:pPr>
+      <w:r>
+        <w:rPr>
+          <w:b/>
+          <w:bCs/>
+        </w:rPr>
+        <w:t xml:space="preserve">Tema:</w:t>
+      </w:r>
+      <w:r>
+        <w:t xml:space="preserve"> </w:t>
+      </w:r>
+      <w:r>
+        <w:t xml:space="preserve">Creación de la Arquitectura y Desarrollo del Proceso de Extracción (E de ETL)</w:t>
+      </w:r>
+    </w:p>
+    <w:p>
+      <w:pPr>
+        <w:pStyle w:val="BodyText"/>
+      </w:pPr>
+      <w:r>
+        <w:rPr>
+          <w:b/>
+          <w:bCs/>
+        </w:rPr>
+        <w:t xml:space="preserve">Docente:</w:t>
+      </w:r>
+      <w:r>
+        <w:t xml:space="preserve"> </w:t>
+      </w:r>
+      <w:r>
+        <w:t xml:space="preserve">Francis Ramírez</w:t>
+      </w:r>
+    </w:p>
+    <w:p>
+      <w:pPr>
+        <w:pStyle w:val="BodyText"/>
+      </w:pPr>
+      <w:r>
+        <w:rPr>
+          <w:b/>
+          <w:bCs/>
+        </w:rPr>
+        <w:t xml:space="preserve">Fecha de entrega:</w:t>
+      </w:r>
+      <w:r>
+        <w:t xml:space="preserve"> </w:t>
+      </w:r>
+      <w:r>
+        <w:t xml:space="preserve">05/08/2026</w:t>
+      </w:r>
+    </w:p>
+    <w:p>
+      <w:pPr>
+        <w:pStyle w:val="BodyText"/>
+      </w:pPr>
+      <w:r>
+        <w:rPr>
+          <w:b/>
+          <w:bCs/>
+        </w:rPr>
+        <w:t xml:space="preserve">Repositorio de GitHub:</w:t>
+      </w:r>
+      <w:r>
+        <w:t xml:space="preserve"> </w:t>
+      </w:r>
+      <w:r>
+        <w:t xml:space="preserve">https://github.com/MarioMahir/-SistemaAnalisisOpiniones</w:t>
+      </w:r>
+    </w:p>
+    <w:p>
+      <w:r>
+        <w:pict>
+          <v:rect style="width:0;height:1.5pt" o:hralign="center" o:hrstd="t" o:hr="t"/>
+        </w:pict>
+      </w:r>
+    </w:p>
+    <w:bookmarkStart w:id="21" w:name="introducción"/>
+    <w:p>
+      <w:pPr>
+        <w:pStyle w:val="Heading2"/>
+      </w:pPr>
+      <w:r>
+        <w:t xml:space="preserve">1. Introducción</w:t>
+      </w:r>
+    </w:p>
+    <w:p>
+      <w:pPr>
+        <w:pStyle w:val="FirstParagraph"/>
+      </w:pPr>
+      <w:r>
+        <w:t xml:space="preserve">Este documento describe la arquitectura y la implementación del proceso de</w:t>
+      </w:r>
+      <w:r>
+        <w:t xml:space="preserve"> </w:t>
+      </w:r>
+      <w:r>
+        <w:rPr>
+          <w:b/>
+          <w:bCs/>
+        </w:rPr>
+        <w:t xml:space="preserve">extracción (E de ETL)</w:t>
+      </w:r>
+      <w:r>
+        <w:t xml:space="preserve"> </w:t>
+      </w:r>
+      <w:r>
+        <w:t xml:space="preserve">del Sistema de Análisis de Opiniones de Clientes. El sistema consolida opiniones que llegan por tres canales heterogéneos:</w:t>
+      </w:r>
+    </w:p>
+    <w:p>
+      <w:pPr>
+        <w:pStyle w:val="Compact"/>
+        <w:numPr>
+          <w:ilvl w:val="0"/>
+          <w:numId w:val="1001"/>
+        </w:numPr>
+      </w:pPr>
+      <w:r>
+        <w:rPr>
+          <w:b/>
+          <w:bCs/>
+        </w:rPr>
+        <w:t xml:space="preserve">Archivos CSV</w:t>
+      </w:r>
+      <w:r>
+        <w:t xml:space="preserve"> </w:t>
+      </w:r>
+      <w:r>
+        <w:t xml:space="preserve">— encuestas internas de satisfacción y catálogos (clientes, productos, fuentes de dato).</w:t>
+      </w:r>
+    </w:p>
+    <w:p>
+      <w:pPr>
+        <w:pStyle w:val="Compact"/>
+        <w:numPr>
+          <w:ilvl w:val="0"/>
+          <w:numId w:val="1001"/>
+        </w:numPr>
+      </w:pPr>
+      <w:r>
+        <w:rPr>
+          <w:b/>
+          <w:bCs/>
+        </w:rPr>
+        <w:t xml:space="preserve">Base de datos relacional</w:t>
+      </w:r>
+      <w:r>
+        <w:t xml:space="preserve"> </w:t>
+      </w:r>
+      <w:r>
+        <w:t xml:space="preserve">(</w:t>
+      </w:r>
+      <w:r>
+        <w:rPr>
+          <w:rStyle w:val="VerbatimChar"/>
+        </w:rPr>
+        <w:t xml:space="preserve">TiendaWebOrigen</w:t>
+      </w:r>
+      <w:r>
+        <w:t xml:space="preserve">) — reseñas publicadas en el sitio web de la tienda.</w:t>
+      </w:r>
+    </w:p>
+    <w:p>
+      <w:pPr>
+        <w:pStyle w:val="Compact"/>
+        <w:numPr>
+          <w:ilvl w:val="0"/>
+          <w:numId w:val="1001"/>
+        </w:numPr>
+      </w:pPr>
+      <w:r>
+        <w:rPr>
+          <w:b/>
+          <w:bCs/>
+        </w:rPr>
+        <w:t xml:space="preserve">API REST</w:t>
+      </w:r>
+      <w:r>
+        <w:t xml:space="preserve"> </w:t>
+      </w:r>
+      <w:r>
+        <w:t xml:space="preserve">(</w:t>
+      </w:r>
+      <w:r>
+        <w:rPr>
+          <w:rStyle w:val="VerbatimChar"/>
+        </w:rPr>
+        <w:t xml:space="preserve">TiendaSocialApi</w:t>
+      </w:r>
+      <w:r>
+        <w:t xml:space="preserve">) — comentarios de redes sociales.</w:t>
+      </w:r>
+    </w:p>
+    <w:p>
+      <w:pPr>
+        <w:pStyle w:val="FirstParagraph"/>
+      </w:pPr>
+      <w:r>
+        <w:t xml:space="preserve">El proceso se implementó como un</w:t>
+      </w:r>
+      <w:r>
+        <w:t xml:space="preserve"> </w:t>
+      </w:r>
+      <w:r>
+        <w:rPr>
+          <w:b/>
+          <w:bCs/>
+        </w:rPr>
+        <w:t xml:space="preserve">Worker Service en .NET 8</w:t>
+      </w:r>
+      <w:r>
+        <w:t xml:space="preserve"> </w:t>
+      </w:r>
+      <w:r>
+        <w:t xml:space="preserve">que extrae de las tres fuentes</w:t>
+      </w:r>
+      <w:r>
+        <w:t xml:space="preserve"> </w:t>
+      </w:r>
+      <w:r>
+        <w:rPr>
+          <w:b/>
+          <w:bCs/>
+        </w:rPr>
+        <w:t xml:space="preserve">en paralelo</w:t>
+      </w:r>
+      <w:r>
+        <w:t xml:space="preserve">, valida los registros y los guarda en las tablas de</w:t>
+      </w:r>
+      <w:r>
+        <w:t xml:space="preserve"> </w:t>
+      </w:r>
+      <w:r>
+        <w:rPr>
+          <w:i/>
+          <w:iCs/>
+        </w:rPr>
+        <w:t xml:space="preserve">staging</w:t>
+      </w:r>
+      <w:r>
+        <w:t xml:space="preserve"> </w:t>
+      </w:r>
+      <w:r>
+        <w:t xml:space="preserve">de la base de datos</w:t>
+      </w:r>
+      <w:r>
+        <w:t xml:space="preserve"> </w:t>
+      </w:r>
+      <w:r>
+        <w:rPr>
+          <w:rStyle w:val="VerbatimChar"/>
+        </w:rPr>
+        <w:t xml:space="preserve">SistemaAnalisisOpiniones</w:t>
+      </w:r>
+      <w:r>
+        <w:t xml:space="preserve">.</w:t>
+      </w:r>
+    </w:p>
+    <w:bookmarkEnd w:id="21"/>
+    <w:bookmarkStart w:id="25" w:name="diagrama-de-arquitectura"/>
+    <w:p>
+      <w:pPr>
+        <w:pStyle w:val="Heading2"/>
+      </w:pPr>
+      <w:r>
+        <w:t xml:space="preserve">2. Diagrama de arquitectura</w:t>
+      </w:r>
+    </w:p>
+    <w:p>
+      <w:pPr>
+        <w:pStyle w:val="CaptionedFigure"/>
+      </w:pPr>
+      <w:r>
+        <w:drawing>
+          <wp:inline>
+            <wp:extent cx="5943600" cy="2653392"/>
+            <wp:effectExtent b="0" l="0" r="0" t="0"/>
+            <wp:docPr descr="Diagrama de arquitectura" title="" id="23" name="Picture"/>
+            <a:graphic>
+              <a:graphicData uri="http://schemas.openxmlformats.org/drawingml/2006/picture">
+                <pic:pic>
+                  <pic:nvPicPr>
+                    <pic:cNvPr descr="diagramas/arquitectura.png" id="24" name="Picture"/>
+                    <pic:cNvPicPr>
+                      <a:picLocks noChangeArrowheads="1" noChangeAspect="1"/>
+                    </pic:cNvPicPr>
+                  </pic:nvPicPr>
+                  <pic:blipFill>
+                    <a:blip r:embed="rId22"/>
+                    <a:stretch>
+                      <a:fillRect/>
+                    </a:stretch>
+                  </pic:blipFill>
+                  <pic:spPr bwMode="auto">
+                    <a:xfrm>
+                      <a:off x="0" y="0"/>
+                      <a:ext cx="5943600" cy="2653392"/>
                     </a:xfrm>
                     <a:prstGeom prst="rect">
                       <a:avLst/>
@@ -816,8 +828,8 @@
         <w:t xml:space="preserve">, modelo estrella ya diseñado en la actividad anterior) y el módulo de visualización se integran en fases posteriores; la arquitectura ya los contempla como destinos de la transformación.</w:t>
       </w:r>
     </w:p>
-    <w:bookmarkEnd w:id="14"/>
-    <w:bookmarkStart w:id="18" w:name="diagrama-de-flujo-del-proceso"/>
+    <w:bookmarkEnd w:id="25"/>
+    <w:bookmarkStart w:id="29" w:name="diagrama-de-flujo-del-proceso"/>
     <w:p>
       <w:pPr>
         <w:pStyle w:val="Heading2"/>
@@ -833,20 +845,20 @@
       <w:r>
         <w:drawing>
           <wp:inline>
-            <wp:extent cx="5334000" cy="11321142"/>
+            <wp:extent cx="5943600" cy="12614987"/>
             <wp:effectExtent b="0" l="0" r="0" t="0"/>
-            <wp:docPr descr="Diagrama de flujo" title="" id="16" name="Picture"/>
+            <wp:docPr descr="Diagrama de flujo" title="" id="27" name="Picture"/>
             <a:graphic>
               <a:graphicData uri="http://schemas.openxmlformats.org/drawingml/2006/picture">
                 <pic:pic>
                   <pic:nvPicPr>
-                    <pic:cNvPr descr="diagramas/flujo.png" id="17" name="Picture"/>
+                    <pic:cNvPr descr="diagramas/flujo.png" id="28" name="Picture"/>
                     <pic:cNvPicPr>
                       <a:picLocks noChangeArrowheads="1" noChangeAspect="1"/>
                     </pic:cNvPicPr>
                   </pic:nvPicPr>
                   <pic:blipFill>
-                    <a:blip r:embed="rId15"/>
+                    <a:blip r:embed="rId26"/>
                     <a:stretch>
                       <a:fillRect/>
                     </a:stretch>
@@ -854,7 +866,7 @@
                   <pic:spPr bwMode="auto">
                     <a:xfrm>
                       <a:off x="0" y="0"/>
-                      <a:ext cx="5334000" cy="11321142"/>
+                      <a:ext cx="5943600" cy="12614987"/>
                     </a:xfrm>
                     <a:prstGeom prst="rect">
                       <a:avLst/>
@@ -996,8 +1008,8 @@
         <w:t xml:space="preserve">.</w:t>
       </w:r>
     </w:p>
-    <w:bookmarkEnd w:id="18"/>
-    <w:bookmarkStart w:id="22" w:name="diseño-de-la-solución"/>
+    <w:bookmarkEnd w:id="29"/>
+    <w:bookmarkStart w:id="33" w:name="diseño-de-la-solución"/>
     <w:p>
       <w:pPr>
         <w:pStyle w:val="Heading2"/>
@@ -1006,7 +1018,7 @@
         <w:t xml:space="preserve">4. Diseño de la solución</w:t>
       </w:r>
     </w:p>
-    <w:bookmarkStart w:id="19" w:name="estructura-en-capas"/>
+    <w:bookmarkStart w:id="30" w:name="estructura-en-capas"/>
     <w:p>
       <w:pPr>
         <w:pStyle w:val="Heading3"/>
@@ -1079,8 +1091,8 @@
         <w:t xml:space="preserve">└── Worker.cs         BackgroundService que dispara el proceso</w:t>
       </w:r>
     </w:p>
-    <w:bookmarkEnd w:id="19"/>
-    <w:bookmarkStart w:id="20" w:name="la-abstracción-iextractor"/>
+    <w:bookmarkEnd w:id="30"/>
+    <w:bookmarkStart w:id="31" w:name="la-abstracción-iextractor"/>
     <w:p>
       <w:pPr>
         <w:pStyle w:val="Heading3"/>
@@ -1464,8 +1476,8 @@
         <w:t xml:space="preserve">(principio abierto/cerrado).</w:t>
       </w:r>
     </w:p>
-    <w:bookmarkEnd w:id="20"/>
-    <w:bookmarkStart w:id="21" w:name="fuentes-de-datos-reales"/>
+    <w:bookmarkEnd w:id="31"/>
+    <w:bookmarkStart w:id="32" w:name="fuentes-de-datos-reales"/>
     <w:p>
       <w:pPr>
         <w:pStyle w:val="Heading3"/>
@@ -1668,9 +1680,9 @@
         <w:t xml:space="preserve">y timeout configurables.</w:t>
       </w:r>
     </w:p>
-    <w:bookmarkEnd w:id="21"/>
-    <w:bookmarkEnd w:id="22"/>
-    <w:bookmarkStart w:id="27" w:name="cumplimiento-de-los-atributos-de-calidad"/>
+    <w:bookmarkEnd w:id="32"/>
+    <w:bookmarkEnd w:id="33"/>
+    <w:bookmarkStart w:id="38" w:name="cumplimiento-de-los-atributos-de-calidad"/>
     <w:p>
       <w:pPr>
         <w:pStyle w:val="Heading2"/>
@@ -1679,7 +1691,7 @@
         <w:t xml:space="preserve">5. Cumplimiento de los atributos de calidad</w:t>
       </w:r>
     </w:p>
-    <w:bookmarkStart w:id="23" w:name="rendimiento"/>
+    <w:bookmarkStart w:id="34" w:name="rendimiento"/>
     <w:p>
       <w:pPr>
         <w:pStyle w:val="Heading3"/>
@@ -2118,8 +2130,8 @@
         <w:t xml:space="preserve">La fase paralela tomó 472 ms cuando la suma secuencial habría sido 556 ms; con fuentes remotas de mayor latencia la ganancia crece proporcionalmente.</w:t>
       </w:r>
     </w:p>
-    <w:bookmarkEnd w:id="23"/>
-    <w:bookmarkStart w:id="24" w:name="escalabilidad"/>
+    <w:bookmarkEnd w:id="34"/>
+    <w:bookmarkStart w:id="35" w:name="escalabilidad"/>
     <w:p>
       <w:pPr>
         <w:pStyle w:val="Heading3"/>
@@ -2246,8 +2258,8 @@
         <w:t xml:space="preserve">+ una subsección de configuración + un registro en el contenedor de dependencias. Ni el orquestador ni las demás fuentes cambian.</w:t>
       </w:r>
     </w:p>
-    <w:bookmarkEnd w:id="24"/>
-    <w:bookmarkStart w:id="25" w:name="seguridad"/>
+    <w:bookmarkEnd w:id="35"/>
+    <w:bookmarkStart w:id="36" w:name="seguridad"/>
     <w:p>
       <w:pPr>
         <w:pStyle w:val="Heading3"/>
@@ -2394,8 +2406,8 @@
         <w:t xml:space="preserve">(gestión correcta del pool de conexiones) y timeout configurado.</w:t>
       </w:r>
     </w:p>
-    <w:bookmarkEnd w:id="25"/>
-    <w:bookmarkStart w:id="26" w:name="mantenibilidad"/>
+    <w:bookmarkEnd w:id="36"/>
+    <w:bookmarkStart w:id="37" w:name="mantenibilidad"/>
     <w:p>
       <w:pPr>
         <w:pStyle w:val="Heading3"/>
@@ -2537,9 +2549,9 @@
         <w:t xml:space="preserve">en todos los componentes, resumen tabular en consola y log CSV de rechazados con fila, clave y motivo.</w:t>
       </w:r>
     </w:p>
-    <w:bookmarkEnd w:id="26"/>
-    <w:bookmarkEnd w:id="27"/>
-    <w:bookmarkStart w:id="28" w:name="resiliencia-comprobada"/>
+    <w:bookmarkEnd w:id="37"/>
+    <w:bookmarkEnd w:id="38"/>
+    <w:bookmarkStart w:id="39" w:name="resiliencia-comprobada"/>
     <w:p>
       <w:pPr>
         <w:pStyle w:val="Heading2"/>
@@ -2595,8 +2607,8 @@
         <w:t xml:space="preserve">con su motivo, y las fuentes CSV y base de datos completaron su extracción y carga con normalidad. Una fuente caída degrada el resultado, no tumba el proceso.</w:t>
       </w:r>
     </w:p>
-    <w:bookmarkEnd w:id="28"/>
-    <w:bookmarkStart w:id="29" w:name="evidencia-de-la-ejecución"/>
+    <w:bookmarkEnd w:id="39"/>
+    <w:bookmarkStart w:id="40" w:name="evidencia-de-la-ejecución"/>
     <w:p>
       <w:pPr>
         <w:pStyle w:val="Heading2"/>
@@ -2885,8 +2897,8 @@
         <w:t xml:space="preserve">). El ETL detecta correctamente esa falta de integridad referencial y rechaza los registros con su motivo en lugar de insertar datos huérfanos, que es exactamente el comportamiento deseado de una fase de validación. Unificar el esquema de IDs de los archivos fuente resolvería los rechazos sin cambiar el código.</w:t>
       </w:r>
     </w:p>
-    <w:bookmarkEnd w:id="29"/>
-    <w:bookmarkStart w:id="30" w:name="ejecución-del-proyecto"/>
+    <w:bookmarkEnd w:id="40"/>
+    <w:bookmarkStart w:id="41" w:name="ejecución-del-proyecto"/>
     <w:p>
       <w:pPr>
         <w:pStyle w:val="Heading2"/>
@@ -3106,8 +3118,8 @@
         <w:t xml:space="preserve"> SistemaAnalisisOpiniones</w:t>
       </w:r>
     </w:p>
-    <w:bookmarkEnd w:id="30"/>
-    <w:bookmarkStart w:id="31" w:name="conclusiones"/>
+    <w:bookmarkEnd w:id="41"/>
+    <w:bookmarkStart w:id="42" w:name="conclusiones"/>
     <w:p>
       <w:pPr>
         <w:pStyle w:val="Heading2"/>
@@ -3139,12 +3151,12 @@
         <w:t xml:space="preserve">(escalabilidad), credenciales fuera del código y SQL parametrizado (seguridad), y separación estricta de responsabilidades por capas con abstracciones e inyección de dependencias (mantenibilidad). Sobre esta base, las siguientes fases del proyecto (transformación hacia el modelo estrella y visualización) se integran sin modificar lo construido.</w:t>
       </w:r>
     </w:p>
-    <w:bookmarkEnd w:id="31"/>
-    <w:bookmarkEnd w:id="32"/>
+    <w:bookmarkEnd w:id="42"/>
     <w:sectPr>
-      <w:footnotePr>
-        <w:numRestart w:val="eachSect"/>
-      </w:footnotePr>
+      <w:pgSz w:h="15840" w:w="12240"/>
+      <w:pgMar w:bottom="1440" w:footer="708" w:gutter="0" w:header="708" w:left="1440" w:right="1440" w:top="1440"/>
+      <w:cols w:space="708"/>
+      <w:docGrid w:linePitch="360"/>
     </w:sectPr>
   </w:body>
 </w:document>
@@ -3174,7 +3186,874 @@
 </file>
 
 <file path=word/numbering.xml><?xml version="1.0" encoding="utf-8"?>
-<w:numbering xmlns:w="http://schemas.openxmlformats.org/wordprocessingml/2006/main">
+<w:numbering xmlns:aink="http://schemas.microsoft.com/office/drawing/2016/ink" xmlns:am3d="http://schemas.microsoft.com/office/drawing/2017/model3d" xmlns:cx="http://schemas.microsoft.com/office/drawing/2014/chartex" xmlns:cx1="http://schemas.microsoft.com/office/drawing/2015/9/8/chartex" xmlns:cx2="http://schemas.microsoft.com/office/drawing/2015/10/21/chartex" xmlns:cx3="http://schemas.microsoft.com/office/drawing/2016/5/9/chartex" xmlns:cx4="http://schemas.microsoft.com/office/drawing/2016/5/10/chartex" xmlns:cx5="http://schemas.microsoft.com/office/drawing/2016/5/11/chartex" xmlns:cx6="http://schemas.microsoft.com/office/drawing/2016/5/12/chartex" xmlns:cx7="http://schemas.microsoft.com/office/drawing/2016/5/13/chartex" xmlns:cx8="http://schemas.microsoft.com/office/drawing/2016/5/14/chartex" xmlns:m="http://schemas.openxmlformats.org/officeDocument/2006/math" xmlns:mc="http://schemas.openxmlformats.org/markup-compatibility/2006" xmlns:o="urn:schemas-microsoft-com:office:office" xmlns:oel="http://schemas.microsoft.com/office/2019/extlst" xmlns:r="http://schemas.openxmlformats.org/officeDocument/2006/relationships" xmlns:v="urn:schemas-microsoft-com:vml" xmlns:w="http://schemas.openxmlformats.org/wordprocessingml/2006/main" xmlns:w10="urn:schemas-microsoft-com:office:word" xmlns:w14="http://schemas.microsoft.com/office/word/2010/wordml" xmlns:w15="http://schemas.microsoft.com/office/word/2012/wordml" xmlns:w16="http://schemas.microsoft.com/office/word/2018/wordml" xmlns:w16cex="http://schemas.microsoft.com/office/word/2018/wordml/cex" xmlns:w16cid="http://schemas.microsoft.com/office/word/2016/wordml/cid" xmlns:w16du="http://schemas.microsoft.com/office/word/2023/wordml/word16du" xmlns:w16sdtdh="http://schemas.microsoft.com/office/word/2020/wordml/sdtdatahash" xmlns:w16sdtfl="http://schemas.microsoft.com/office/word/2024/wordml/sdtformatlock" xmlns:w16se="http://schemas.microsoft.com/office/word/2015/wordml/symex" xmlns:wne="http://schemas.microsoft.com/office/word/2006/wordml" xmlns:wp="http://schemas.openxmlformats.org/drawingml/2006/wordprocessingDrawing" xmlns:wp14="http://schemas.microsoft.com/office/word/2010/wordprocessingDrawing" xmlns:wpc="http://schemas.microsoft.com/office/word/2010/wordprocessingCanvas" xmlns:wpg="http://schemas.microsoft.com/office/word/2010/wordprocessingGroup" xmlns:wpi="http://schemas.microsoft.com/office/word/2010/wordprocessingInk" xmlns:wps="http://schemas.microsoft.com/office/word/2010/wordprocessingShape" mc:Ignorable="w14 w15 w16se w16cid w16 w16cex w16sdtdh w16sdtfl w16du wp14">
+  <w:abstractNum w15:restartNumberingAfterBreak="0" w:abstractNumId="0">
+    <w:nsid w:val="23361190"/>
+    <w:multiLevelType w:val="hybridMultilevel"/>
+    <w:tmpl w:val="AD94B02E"/>
+    <w:lvl w:ilvl="0" w:tplc="A34E8AC2">
+      <w:numFmt w:val="bullet"/>
+      <w:lvlText w:val="-"/>
+      <w:lvlJc w:val="left"/>
+      <w:pPr>
+        <w:ind w:hanging="360" w:left="1080"/>
+      </w:pPr>
+      <w:rPr>
+        <w:rFonts w:ascii="Times New Roman" w:cs="Times New Roman" w:eastAsiaTheme="minorHAnsi" w:hAnsi="Times New Roman" w:hint="default"/>
+      </w:rPr>
+    </w:lvl>
+    <w:lvl w:ilvl="1" w:tentative="1" w:tplc="04090003">
+      <w:start w:val="1"/>
+      <w:numFmt w:val="bullet"/>
+      <w:lvlText w:val="o"/>
+      <w:lvlJc w:val="left"/>
+      <w:pPr>
+        <w:ind w:hanging="360" w:left="1800"/>
+      </w:pPr>
+      <w:rPr>
+        <w:rFonts w:ascii="Courier New" w:cs="Courier New" w:hAnsi="Courier New" w:hint="default"/>
+      </w:rPr>
+    </w:lvl>
+    <w:lvl w:ilvl="2" w:tentative="1" w:tplc="04090005">
+      <w:start w:val="1"/>
+      <w:numFmt w:val="bullet"/>
+      <w:lvlText w:val=""/>
+      <w:lvlJc w:val="left"/>
+      <w:pPr>
+        <w:ind w:hanging="360" w:left="2520"/>
+      </w:pPr>
+      <w:rPr>
+        <w:rFonts w:ascii="Wingdings" w:hAnsi="Wingdings" w:hint="default"/>
+      </w:rPr>
+    </w:lvl>
+    <w:lvl w:ilvl="3" w:tentative="1" w:tplc="04090001">
+      <w:start w:val="1"/>
+      <w:numFmt w:val="bullet"/>
+      <w:lvlText w:val=""/>
+      <w:lvlJc w:val="left"/>
+      <w:pPr>
+        <w:ind w:hanging="360" w:left="3240"/>
+      </w:pPr>
+      <w:rPr>
+        <w:rFonts w:ascii="Symbol" w:hAnsi="Symbol" w:hint="default"/>
+      </w:rPr>
+    </w:lvl>
+    <w:lvl w:ilvl="4" w:tentative="1" w:tplc="04090003">
+      <w:start w:val="1"/>
+      <w:numFmt w:val="bullet"/>
+      <w:lvlText w:val="o"/>
+      <w:lvlJc w:val="left"/>
+      <w:pPr>
+        <w:ind w:hanging="360" w:left="3960"/>
+      </w:pPr>
+      <w:rPr>
+        <w:rFonts w:ascii="Courier New" w:cs="Courier New" w:hAnsi="Courier New" w:hint="default"/>
+      </w:rPr>
+    </w:lvl>
+    <w:lvl w:ilvl="5" w:tentative="1" w:tplc="04090005">
+      <w:start w:val="1"/>
+      <w:numFmt w:val="bullet"/>
+      <w:lvlText w:val=""/>
+      <w:lvlJc w:val="left"/>
+      <w:pPr>
+        <w:ind w:hanging="360" w:left="4680"/>
+      </w:pPr>
+      <w:rPr>
+        <w:rFonts w:ascii="Wingdings" w:hAnsi="Wingdings" w:hint="default"/>
+      </w:rPr>
+    </w:lvl>
+    <w:lvl w:ilvl="6" w:tentative="1" w:tplc="04090001">
+      <w:start w:val="1"/>
+      <w:numFmt w:val="bullet"/>
+      <w:lvlText w:val=""/>
+      <w:lvlJc w:val="left"/>
+      <w:pPr>
+        <w:ind w:hanging="360" w:left="5400"/>
+      </w:pPr>
+      <w:rPr>
+        <w:rFonts w:ascii="Symbol" w:hAnsi="Symbol" w:hint="default"/>
+      </w:rPr>
+    </w:lvl>
+    <w:lvl w:ilvl="7" w:tentative="1" w:tplc="04090003">
+      <w:start w:val="1"/>
+      <w:numFmt w:val="bullet"/>
+      <w:lvlText w:val="o"/>
+      <w:lvlJc w:val="left"/>
+      <w:pPr>
+        <w:ind w:hanging="360" w:left="6120"/>
+      </w:pPr>
+      <w:rPr>
+        <w:rFonts w:ascii="Courier New" w:cs="Courier New" w:hAnsi="Courier New" w:hint="default"/>
+      </w:rPr>
+    </w:lvl>
+    <w:lvl w:ilvl="8" w:tentative="1" w:tplc="04090005">
+      <w:start w:val="1"/>
+      <w:numFmt w:val="bullet"/>
+      <w:lvlText w:val=""/>
+      <w:lvlJc w:val="left"/>
+      <w:pPr>
+        <w:ind w:hanging="360" w:left="6840"/>
+      </w:pPr>
+      <w:rPr>
+        <w:rFonts w:ascii="Wingdings" w:hAnsi="Wingdings" w:hint="default"/>
+      </w:rPr>
+    </w:lvl>
+  </w:abstractNum>
+  <w:abstractNum w15:restartNumberingAfterBreak="0" w:abstractNumId="1">
+    <w:nsid w:val="30D81242"/>
+    <w:multiLevelType w:val="hybridMultilevel"/>
+    <w:tmpl w:val="1E145016"/>
+    <w:lvl w:ilvl="0" w:tplc="04090001">
+      <w:start w:val="1"/>
+      <w:numFmt w:val="bullet"/>
+      <w:lvlText w:val=""/>
+      <w:lvlJc w:val="left"/>
+      <w:pPr>
+        <w:ind w:hanging="360" w:left="720"/>
+      </w:pPr>
+      <w:rPr>
+        <w:rFonts w:ascii="Symbol" w:hAnsi="Symbol" w:hint="default"/>
+      </w:rPr>
+    </w:lvl>
+    <w:lvl w:ilvl="1" w:tentative="1" w:tplc="04090003">
+      <w:start w:val="1"/>
+      <w:numFmt w:val="bullet"/>
+      <w:lvlText w:val="o"/>
+      <w:lvlJc w:val="left"/>
+      <w:pPr>
+        <w:ind w:hanging="360" w:left="1440"/>
+      </w:pPr>
+      <w:rPr>
+        <w:rFonts w:ascii="Courier New" w:cs="Courier New" w:hAnsi="Courier New" w:hint="default"/>
+      </w:rPr>
+    </w:lvl>
+    <w:lvl w:ilvl="2" w:tentative="1" w:tplc="04090005">
+      <w:start w:val="1"/>
+      <w:numFmt w:val="bullet"/>
+      <w:lvlText w:val=""/>
+      <w:lvlJc w:val="left"/>
+      <w:pPr>
+        <w:ind w:hanging="360" w:left="2160"/>
+      </w:pPr>
+      <w:rPr>
+        <w:rFonts w:ascii="Wingdings" w:hAnsi="Wingdings" w:hint="default"/>
+      </w:rPr>
+    </w:lvl>
+    <w:lvl w:ilvl="3" w:tentative="1" w:tplc="04090001">
+      <w:start w:val="1"/>
+      <w:numFmt w:val="bullet"/>
+      <w:lvlText w:val=""/>
+      <w:lvlJc w:val="left"/>
+      <w:pPr>
+        <w:ind w:hanging="360" w:left="2880"/>
+      </w:pPr>
+      <w:rPr>
+        <w:rFonts w:ascii="Symbol" w:hAnsi="Symbol" w:hint="default"/>
+      </w:rPr>
+    </w:lvl>
+    <w:lvl w:ilvl="4" w:tentative="1" w:tplc="04090003">
+      <w:start w:val="1"/>
+      <w:numFmt w:val="bullet"/>
+      <w:lvlText w:val="o"/>
+      <w:lvlJc w:val="left"/>
+      <w:pPr>
+        <w:ind w:hanging="360" w:left="3600"/>
+      </w:pPr>
+      <w:rPr>
+        <w:rFonts w:ascii="Courier New" w:cs="Courier New" w:hAnsi="Courier New" w:hint="default"/>
+      </w:rPr>
+    </w:lvl>
+    <w:lvl w:ilvl="5" w:tentative="1" w:tplc="04090005">
+      <w:start w:val="1"/>
+      <w:numFmt w:val="bullet"/>
+      <w:lvlText w:val=""/>
+      <w:lvlJc w:val="left"/>
+      <w:pPr>
+        <w:ind w:hanging="360" w:left="4320"/>
+      </w:pPr>
+      <w:rPr>
+        <w:rFonts w:ascii="Wingdings" w:hAnsi="Wingdings" w:hint="default"/>
+      </w:rPr>
+    </w:lvl>
+    <w:lvl w:ilvl="6" w:tentative="1" w:tplc="04090001">
+      <w:start w:val="1"/>
+      <w:numFmt w:val="bullet"/>
+      <w:lvlText w:val=""/>
+      <w:lvlJc w:val="left"/>
+      <w:pPr>
+        <w:ind w:hanging="360" w:left="5040"/>
+      </w:pPr>
+      <w:rPr>
+        <w:rFonts w:ascii="Symbol" w:hAnsi="Symbol" w:hint="default"/>
+      </w:rPr>
+    </w:lvl>
+    <w:lvl w:ilvl="7" w:tentative="1" w:tplc="04090003">
+      <w:start w:val="1"/>
+      <w:numFmt w:val="bullet"/>
+      <w:lvlText w:val="o"/>
+      <w:lvlJc w:val="left"/>
+      <w:pPr>
+        <w:ind w:hanging="360" w:left="5760"/>
+      </w:pPr>
+      <w:rPr>
+        <w:rFonts w:ascii="Courier New" w:cs="Courier New" w:hAnsi="Courier New" w:hint="default"/>
+      </w:rPr>
+    </w:lvl>
+    <w:lvl w:ilvl="8" w:tentative="1" w:tplc="04090005">
+      <w:start w:val="1"/>
+      <w:numFmt w:val="bullet"/>
+      <w:lvlText w:val=""/>
+      <w:lvlJc w:val="left"/>
+      <w:pPr>
+        <w:ind w:hanging="360" w:left="6480"/>
+      </w:pPr>
+      <w:rPr>
+        <w:rFonts w:ascii="Wingdings" w:hAnsi="Wingdings" w:hint="default"/>
+      </w:rPr>
+    </w:lvl>
+  </w:abstractNum>
+  <w:abstractNum w15:restartNumberingAfterBreak="0" w:abstractNumId="2">
+    <w:nsid w:val="3D97020D"/>
+    <w:multiLevelType w:val="hybridMultilevel"/>
+    <w:tmpl w:val="A2FAC258"/>
+    <w:lvl w:ilvl="0" w:tplc="04090001">
+      <w:start w:val="1"/>
+      <w:numFmt w:val="bullet"/>
+      <w:lvlText w:val=""/>
+      <w:lvlJc w:val="left"/>
+      <w:pPr>
+        <w:ind w:hanging="360" w:left="720"/>
+      </w:pPr>
+      <w:rPr>
+        <w:rFonts w:ascii="Symbol" w:hAnsi="Symbol" w:hint="default"/>
+      </w:rPr>
+    </w:lvl>
+    <w:lvl w:ilvl="1" w:tentative="1" w:tplc="04090003">
+      <w:start w:val="1"/>
+      <w:numFmt w:val="bullet"/>
+      <w:lvlText w:val="o"/>
+      <w:lvlJc w:val="left"/>
+      <w:pPr>
+        <w:ind w:hanging="360" w:left="1440"/>
+      </w:pPr>
+      <w:rPr>
+        <w:rFonts w:ascii="Courier New" w:cs="Courier New" w:hAnsi="Courier New" w:hint="default"/>
+      </w:rPr>
+    </w:lvl>
+    <w:lvl w:ilvl="2" w:tentative="1" w:tplc="04090005">
+      <w:start w:val="1"/>
+      <w:numFmt w:val="bullet"/>
+      <w:lvlText w:val=""/>
+      <w:lvlJc w:val="left"/>
+      <w:pPr>
+        <w:ind w:hanging="360" w:left="2160"/>
+      </w:pPr>
+      <w:rPr>
+        <w:rFonts w:ascii="Wingdings" w:hAnsi="Wingdings" w:hint="default"/>
+      </w:rPr>
+    </w:lvl>
+    <w:lvl w:ilvl="3" w:tentative="1" w:tplc="04090001">
+      <w:start w:val="1"/>
+      <w:numFmt w:val="bullet"/>
+      <w:lvlText w:val=""/>
+      <w:lvlJc w:val="left"/>
+      <w:pPr>
+        <w:ind w:hanging="360" w:left="2880"/>
+      </w:pPr>
+      <w:rPr>
+        <w:rFonts w:ascii="Symbol" w:hAnsi="Symbol" w:hint="default"/>
+      </w:rPr>
+    </w:lvl>
+    <w:lvl w:ilvl="4" w:tentative="1" w:tplc="04090003">
+      <w:start w:val="1"/>
+      <w:numFmt w:val="bullet"/>
+      <w:lvlText w:val="o"/>
+      <w:lvlJc w:val="left"/>
+      <w:pPr>
+        <w:ind w:hanging="360" w:left="3600"/>
+      </w:pPr>
+      <w:rPr>
+        <w:rFonts w:ascii="Courier New" w:cs="Courier New" w:hAnsi="Courier New" w:hint="default"/>
+      </w:rPr>
+    </w:lvl>
+    <w:lvl w:ilvl="5" w:tentative="1" w:tplc="04090005">
+      <w:start w:val="1"/>
+      <w:numFmt w:val="bullet"/>
+      <w:lvlText w:val=""/>
+      <w:lvlJc w:val="left"/>
+      <w:pPr>
+        <w:ind w:hanging="360" w:left="4320"/>
+      </w:pPr>
+      <w:rPr>
+        <w:rFonts w:ascii="Wingdings" w:hAnsi="Wingdings" w:hint="default"/>
+      </w:rPr>
+    </w:lvl>
+    <w:lvl w:ilvl="6" w:tentative="1" w:tplc="04090001">
+      <w:start w:val="1"/>
+      <w:numFmt w:val="bullet"/>
+      <w:lvlText w:val=""/>
+      <w:lvlJc w:val="left"/>
+      <w:pPr>
+        <w:ind w:hanging="360" w:left="5040"/>
+      </w:pPr>
+      <w:rPr>
+        <w:rFonts w:ascii="Symbol" w:hAnsi="Symbol" w:hint="default"/>
+      </w:rPr>
+    </w:lvl>
+    <w:lvl w:ilvl="7" w:tentative="1" w:tplc="04090003">
+      <w:start w:val="1"/>
+      <w:numFmt w:val="bullet"/>
+      <w:lvlText w:val="o"/>
+      <w:lvlJc w:val="left"/>
+      <w:pPr>
+        <w:ind w:hanging="360" w:left="5760"/>
+      </w:pPr>
+      <w:rPr>
+        <w:rFonts w:ascii="Courier New" w:cs="Courier New" w:hAnsi="Courier New" w:hint="default"/>
+      </w:rPr>
+    </w:lvl>
+    <w:lvl w:ilvl="8" w:tentative="1" w:tplc="04090005">
+      <w:start w:val="1"/>
+      <w:numFmt w:val="bullet"/>
+      <w:lvlText w:val=""/>
+      <w:lvlJc w:val="left"/>
+      <w:pPr>
+        <w:ind w:hanging="360" w:left="6480"/>
+      </w:pPr>
+      <w:rPr>
+        <w:rFonts w:ascii="Wingdings" w:hAnsi="Wingdings" w:hint="default"/>
+      </w:rPr>
+    </w:lvl>
+  </w:abstractNum>
+  <w:abstractNum w15:restartNumberingAfterBreak="0" w:abstractNumId="3">
+    <w:nsid w:val="4D1D1C53"/>
+    <w:multiLevelType w:val="hybridMultilevel"/>
+    <w:tmpl w:val="EE64F4EC"/>
+    <w:lvl w:ilvl="0" w:tplc="0409000F">
+      <w:start w:val="1"/>
+      <w:numFmt w:val="decimal"/>
+      <w:lvlText w:val="%1."/>
+      <w:lvlJc w:val="left"/>
+      <w:pPr>
+        <w:ind w:hanging="360" w:left="360"/>
+      </w:pPr>
+      <w:rPr>
+        <w:rFonts w:hint="default"/>
+      </w:rPr>
+    </w:lvl>
+    <w:lvl w:ilvl="1" w:tentative="1" w:tplc="04090019">
+      <w:start w:val="1"/>
+      <w:numFmt w:val="lowerLetter"/>
+      <w:lvlText w:val="%2."/>
+      <w:lvlJc w:val="left"/>
+      <w:pPr>
+        <w:ind w:hanging="360" w:left="1080"/>
+      </w:pPr>
+    </w:lvl>
+    <w:lvl w:ilvl="2" w:tentative="1" w:tplc="0409001B">
+      <w:start w:val="1"/>
+      <w:numFmt w:val="lowerRoman"/>
+      <w:lvlText w:val="%3."/>
+      <w:lvlJc w:val="right"/>
+      <w:pPr>
+        <w:ind w:hanging="180" w:left="1800"/>
+      </w:pPr>
+    </w:lvl>
+    <w:lvl w:ilvl="3" w:tentative="1" w:tplc="0409000F">
+      <w:start w:val="1"/>
+      <w:numFmt w:val="decimal"/>
+      <w:lvlText w:val="%4."/>
+      <w:lvlJc w:val="left"/>
+      <w:pPr>
+        <w:ind w:hanging="360" w:left="2520"/>
+      </w:pPr>
+    </w:lvl>
+    <w:lvl w:ilvl="4" w:tentative="1" w:tplc="04090019">
+      <w:start w:val="1"/>
+      <w:numFmt w:val="lowerLetter"/>
+      <w:lvlText w:val="%5."/>
+      <w:lvlJc w:val="left"/>
+      <w:pPr>
+        <w:ind w:hanging="360" w:left="3240"/>
+      </w:pPr>
+    </w:lvl>
+    <w:lvl w:ilvl="5" w:tentative="1" w:tplc="0409001B">
+      <w:start w:val="1"/>
+      <w:numFmt w:val="lowerRoman"/>
+      <w:lvlText w:val="%6."/>
+      <w:lvlJc w:val="right"/>
+      <w:pPr>
+        <w:ind w:hanging="180" w:left="3960"/>
+      </w:pPr>
+    </w:lvl>
+    <w:lvl w:ilvl="6" w:tentative="1" w:tplc="0409000F">
+      <w:start w:val="1"/>
+      <w:numFmt w:val="decimal"/>
+      <w:lvlText w:val="%7."/>
+      <w:lvlJc w:val="left"/>
+      <w:pPr>
+        <w:ind w:hanging="360" w:left="4680"/>
+      </w:pPr>
+    </w:lvl>
+    <w:lvl w:ilvl="7" w:tentative="1" w:tplc="04090019">
+      <w:start w:val="1"/>
+      <w:numFmt w:val="lowerLetter"/>
+      <w:lvlText w:val="%8."/>
+      <w:lvlJc w:val="left"/>
+      <w:pPr>
+        <w:ind w:hanging="360" w:left="5400"/>
+      </w:pPr>
+    </w:lvl>
+    <w:lvl w:ilvl="8" w:tentative="1" w:tplc="0409001B">
+      <w:start w:val="1"/>
+      <w:numFmt w:val="lowerRoman"/>
+      <w:lvlText w:val="%9."/>
+      <w:lvlJc w:val="right"/>
+      <w:pPr>
+        <w:ind w:hanging="180" w:left="6120"/>
+      </w:pPr>
+    </w:lvl>
+  </w:abstractNum>
+  <w:abstractNum w15:restartNumberingAfterBreak="0" w:abstractNumId="4">
+    <w:nsid w:val="55A02367"/>
+    <w:multiLevelType w:val="hybridMultilevel"/>
+    <w:tmpl w:val="BAB06DD8"/>
+    <w:lvl w:ilvl="0" w:tplc="04090001">
+      <w:start w:val="1"/>
+      <w:numFmt w:val="bullet"/>
+      <w:lvlText w:val=""/>
+      <w:lvlJc w:val="left"/>
+      <w:pPr>
+        <w:ind w:hanging="360" w:left="720"/>
+      </w:pPr>
+      <w:rPr>
+        <w:rFonts w:ascii="Symbol" w:hAnsi="Symbol" w:hint="default"/>
+      </w:rPr>
+    </w:lvl>
+    <w:lvl w:ilvl="1" w:tentative="1" w:tplc="04090003">
+      <w:start w:val="1"/>
+      <w:numFmt w:val="bullet"/>
+      <w:lvlText w:val="o"/>
+      <w:lvlJc w:val="left"/>
+      <w:pPr>
+        <w:ind w:hanging="360" w:left="1440"/>
+      </w:pPr>
+      <w:rPr>
+        <w:rFonts w:ascii="Courier New" w:cs="Courier New" w:hAnsi="Courier New" w:hint="default"/>
+      </w:rPr>
+    </w:lvl>
+    <w:lvl w:ilvl="2" w:tentative="1" w:tplc="04090005">
+      <w:start w:val="1"/>
+      <w:numFmt w:val="bullet"/>
+      <w:lvlText w:val=""/>
+      <w:lvlJc w:val="left"/>
+      <w:pPr>
+        <w:ind w:hanging="360" w:left="2160"/>
+      </w:pPr>
+      <w:rPr>
+        <w:rFonts w:ascii="Wingdings" w:hAnsi="Wingdings" w:hint="default"/>
+      </w:rPr>
+    </w:lvl>
+    <w:lvl w:ilvl="3" w:tentative="1" w:tplc="04090001">
+      <w:start w:val="1"/>
+      <w:numFmt w:val="bullet"/>
+      <w:lvlText w:val=""/>
+      <w:lvlJc w:val="left"/>
+      <w:pPr>
+        <w:ind w:hanging="360" w:left="2880"/>
+      </w:pPr>
+      <w:rPr>
+        <w:rFonts w:ascii="Symbol" w:hAnsi="Symbol" w:hint="default"/>
+      </w:rPr>
+    </w:lvl>
+    <w:lvl w:ilvl="4" w:tentative="1" w:tplc="04090003">
+      <w:start w:val="1"/>
+      <w:numFmt w:val="bullet"/>
+      <w:lvlText w:val="o"/>
+      <w:lvlJc w:val="left"/>
+      <w:pPr>
+        <w:ind w:hanging="360" w:left="3600"/>
+      </w:pPr>
+      <w:rPr>
+        <w:rFonts w:ascii="Courier New" w:cs="Courier New" w:hAnsi="Courier New" w:hint="default"/>
+      </w:rPr>
+    </w:lvl>
+    <w:lvl w:ilvl="5" w:tentative="1" w:tplc="04090005">
+      <w:start w:val="1"/>
+      <w:numFmt w:val="bullet"/>
+      <w:lvlText w:val=""/>
+      <w:lvlJc w:val="left"/>
+      <w:pPr>
+        <w:ind w:hanging="360" w:left="4320"/>
+      </w:pPr>
+      <w:rPr>
+        <w:rFonts w:ascii="Wingdings" w:hAnsi="Wingdings" w:hint="default"/>
+      </w:rPr>
+    </w:lvl>
+    <w:lvl w:ilvl="6" w:tentative="1" w:tplc="04090001">
+      <w:start w:val="1"/>
+      <w:numFmt w:val="bullet"/>
+      <w:lvlText w:val=""/>
+      <w:lvlJc w:val="left"/>
+      <w:pPr>
+        <w:ind w:hanging="360" w:left="5040"/>
+      </w:pPr>
+      <w:rPr>
+        <w:rFonts w:ascii="Symbol" w:hAnsi="Symbol" w:hint="default"/>
+      </w:rPr>
+    </w:lvl>
+    <w:lvl w:ilvl="7" w:tentative="1" w:tplc="04090003">
+      <w:start w:val="1"/>
+      <w:numFmt w:val="bullet"/>
+      <w:lvlText w:val="o"/>
+      <w:lvlJc w:val="left"/>
+      <w:pPr>
+        <w:ind w:hanging="360" w:left="5760"/>
+      </w:pPr>
+      <w:rPr>
+        <w:rFonts w:ascii="Courier New" w:cs="Courier New" w:hAnsi="Courier New" w:hint="default"/>
+      </w:rPr>
+    </w:lvl>
+    <w:lvl w:ilvl="8" w:tentative="1" w:tplc="04090005">
+      <w:start w:val="1"/>
+      <w:numFmt w:val="bullet"/>
+      <w:lvlText w:val=""/>
+      <w:lvlJc w:val="left"/>
+      <w:pPr>
+        <w:ind w:hanging="360" w:left="6480"/>
+      </w:pPr>
+      <w:rPr>
+        <w:rFonts w:ascii="Wingdings" w:hAnsi="Wingdings" w:hint="default"/>
+      </w:rPr>
+    </w:lvl>
+  </w:abstractNum>
+  <w:abstractNum w15:restartNumberingAfterBreak="0" w:abstractNumId="5">
+    <w:nsid w:val="75C2608D"/>
+    <w:multiLevelType w:val="multilevel"/>
+    <w:tmpl w:val="6C04433C"/>
+    <w:lvl w:ilvl="0">
+      <w:start w:val="1"/>
+      <w:numFmt w:val="decimal"/>
+      <w:lvlText w:val="%1."/>
+      <w:lvlJc w:val="left"/>
+      <w:pPr>
+        <w:ind w:hanging="360" w:left="720"/>
+      </w:pPr>
+      <w:rPr>
+        <w:rFonts w:hint="default"/>
+        <w:b/>
+        <w:bCs/>
+      </w:rPr>
+    </w:lvl>
+    <w:lvl w:ilvl="1">
+      <w:start w:val="1"/>
+      <w:numFmt w:val="decimal"/>
+      <w:isLgl/>
+      <w:lvlText w:val="%1.%2."/>
+      <w:lvlJc w:val="left"/>
+      <w:pPr>
+        <w:ind w:hanging="360" w:left="1080"/>
+      </w:pPr>
+      <w:rPr>
+        <w:rFonts w:hint="default"/>
+        <w:b/>
+        <w:bCs/>
+      </w:rPr>
+    </w:lvl>
+    <w:lvl w:ilvl="2">
+      <w:start w:val="1"/>
+      <w:numFmt w:val="decimal"/>
+      <w:isLgl/>
+      <w:lvlText w:val="%1.%2.%3."/>
+      <w:lvlJc w:val="left"/>
+      <w:pPr>
+        <w:ind w:hanging="720" w:left="1800"/>
+      </w:pPr>
+      <w:rPr>
+        <w:rFonts w:hint="default"/>
+      </w:rPr>
+    </w:lvl>
+    <w:lvl w:ilvl="3">
+      <w:start w:val="1"/>
+      <w:numFmt w:val="decimal"/>
+      <w:isLgl/>
+      <w:lvlText w:val="%1.%2.%3.%4."/>
+      <w:lvlJc w:val="left"/>
+      <w:pPr>
+        <w:ind w:hanging="720" w:left="2160"/>
+      </w:pPr>
+      <w:rPr>
+        <w:rFonts w:hint="default"/>
+      </w:rPr>
+    </w:lvl>
+    <w:lvl w:ilvl="4">
+      <w:start w:val="1"/>
+      <w:numFmt w:val="decimal"/>
+      <w:isLgl/>
+      <w:lvlText w:val="%1.%2.%3.%4.%5."/>
+      <w:lvlJc w:val="left"/>
+      <w:pPr>
+        <w:ind w:hanging="1080" w:left="2880"/>
+      </w:pPr>
+      <w:rPr>
+        <w:rFonts w:hint="default"/>
+      </w:rPr>
+    </w:lvl>
+    <w:lvl w:ilvl="5">
+      <w:start w:val="1"/>
+      <w:numFmt w:val="decimal"/>
+      <w:isLgl/>
+      <w:lvlText w:val="%1.%2.%3.%4.%5.%6."/>
+      <w:lvlJc w:val="left"/>
+      <w:pPr>
+        <w:ind w:hanging="1080" w:left="3240"/>
+      </w:pPr>
+      <w:rPr>
+        <w:rFonts w:hint="default"/>
+      </w:rPr>
+    </w:lvl>
+    <w:lvl w:ilvl="6">
+      <w:start w:val="1"/>
+      <w:numFmt w:val="decimal"/>
+      <w:isLgl/>
+      <w:lvlText w:val="%1.%2.%3.%4.%5.%6.%7."/>
+      <w:lvlJc w:val="left"/>
+      <w:pPr>
+        <w:ind w:hanging="1440" w:left="3960"/>
+      </w:pPr>
+      <w:rPr>
+        <w:rFonts w:hint="default"/>
+      </w:rPr>
+    </w:lvl>
+    <w:lvl w:ilvl="7">
+      <w:start w:val="1"/>
+      <w:numFmt w:val="decimal"/>
+      <w:isLgl/>
+      <w:lvlText w:val="%1.%2.%3.%4.%5.%6.%7.%8."/>
+      <w:lvlJc w:val="left"/>
+      <w:pPr>
+        <w:ind w:hanging="1440" w:left="4320"/>
+      </w:pPr>
+      <w:rPr>
+        <w:rFonts w:hint="default"/>
+      </w:rPr>
+    </w:lvl>
+    <w:lvl w:ilvl="8">
+      <w:start w:val="1"/>
+      <w:numFmt w:val="decimal"/>
+      <w:isLgl/>
+      <w:lvlText w:val="%1.%2.%3.%4.%5.%6.%7.%8.%9."/>
+      <w:lvlJc w:val="left"/>
+      <w:pPr>
+        <w:ind w:hanging="1800" w:left="5040"/>
+      </w:pPr>
+      <w:rPr>
+        <w:rFonts w:hint="default"/>
+      </w:rPr>
+    </w:lvl>
+  </w:abstractNum>
+  <w:abstractNum w15:restartNumberingAfterBreak="0" w:abstractNumId="6">
+    <w:nsid w:val="78D42EBB"/>
+    <w:multiLevelType w:val="hybridMultilevel"/>
+    <w:tmpl w:val="032C313E"/>
+    <w:lvl w:ilvl="0" w:tplc="04090001">
+      <w:start w:val="1"/>
+      <w:numFmt w:val="bullet"/>
+      <w:lvlText w:val=""/>
+      <w:lvlJc w:val="left"/>
+      <w:pPr>
+        <w:ind w:hanging="360" w:left="720"/>
+      </w:pPr>
+      <w:rPr>
+        <w:rFonts w:ascii="Symbol" w:hAnsi="Symbol" w:hint="default"/>
+      </w:rPr>
+    </w:lvl>
+    <w:lvl w:ilvl="1" w:tentative="1" w:tplc="04090003">
+      <w:start w:val="1"/>
+      <w:numFmt w:val="bullet"/>
+      <w:lvlText w:val="o"/>
+      <w:lvlJc w:val="left"/>
+      <w:pPr>
+        <w:ind w:hanging="360" w:left="1440"/>
+      </w:pPr>
+      <w:rPr>
+        <w:rFonts w:ascii="Courier New" w:cs="Courier New" w:hAnsi="Courier New" w:hint="default"/>
+      </w:rPr>
+    </w:lvl>
+    <w:lvl w:ilvl="2" w:tentative="1" w:tplc="04090005">
+      <w:start w:val="1"/>
+      <w:numFmt w:val="bullet"/>
+      <w:lvlText w:val=""/>
+      <w:lvlJc w:val="left"/>
+      <w:pPr>
+        <w:ind w:hanging="360" w:left="2160"/>
+      </w:pPr>
+      <w:rPr>
+        <w:rFonts w:ascii="Wingdings" w:hAnsi="Wingdings" w:hint="default"/>
+      </w:rPr>
+    </w:lvl>
+    <w:lvl w:ilvl="3" w:tentative="1" w:tplc="04090001">
+      <w:start w:val="1"/>
+      <w:numFmt w:val="bullet"/>
+      <w:lvlText w:val=""/>
+      <w:lvlJc w:val="left"/>
+      <w:pPr>
+        <w:ind w:hanging="360" w:left="2880"/>
+      </w:pPr>
+      <w:rPr>
+        <w:rFonts w:ascii="Symbol" w:hAnsi="Symbol" w:hint="default"/>
+      </w:rPr>
+    </w:lvl>
+    <w:lvl w:ilvl="4" w:tentative="1" w:tplc="04090003">
+      <w:start w:val="1"/>
+      <w:numFmt w:val="bullet"/>
+      <w:lvlText w:val="o"/>
+      <w:lvlJc w:val="left"/>
+      <w:pPr>
+        <w:ind w:hanging="360" w:left="3600"/>
+      </w:pPr>
+      <w:rPr>
+        <w:rFonts w:ascii="Courier New" w:cs="Courier New" w:hAnsi="Courier New" w:hint="default"/>
+      </w:rPr>
+    </w:lvl>
+    <w:lvl w:ilvl="5" w:tentative="1" w:tplc="04090005">
+      <w:start w:val="1"/>
+      <w:numFmt w:val="bullet"/>
+      <w:lvlText w:val=""/>
+      <w:lvlJc w:val="left"/>
+      <w:pPr>
+        <w:ind w:hanging="360" w:left="4320"/>
+      </w:pPr>
+      <w:rPr>
+        <w:rFonts w:ascii="Wingdings" w:hAnsi="Wingdings" w:hint="default"/>
+      </w:rPr>
+    </w:lvl>
+    <w:lvl w:ilvl="6" w:tentative="1" w:tplc="04090001">
+      <w:start w:val="1"/>
+      <w:numFmt w:val="bullet"/>
+      <w:lvlText w:val=""/>
+      <w:lvlJc w:val="left"/>
+      <w:pPr>
+        <w:ind w:hanging="360" w:left="5040"/>
+      </w:pPr>
+      <w:rPr>
+        <w:rFonts w:ascii="Symbol" w:hAnsi="Symbol" w:hint="default"/>
+      </w:rPr>
+    </w:lvl>
+    <w:lvl w:ilvl="7" w:tentative="1" w:tplc="04090003">
+      <w:start w:val="1"/>
+      <w:numFmt w:val="bullet"/>
+      <w:lvlText w:val="o"/>
+      <w:lvlJc w:val="left"/>
+      <w:pPr>
+        <w:ind w:hanging="360" w:left="5760"/>
+      </w:pPr>
+      <w:rPr>
+        <w:rFonts w:ascii="Courier New" w:cs="Courier New" w:hAnsi="Courier New" w:hint="default"/>
+      </w:rPr>
+    </w:lvl>
+    <w:lvl w:ilvl="8" w:tentative="1" w:tplc="04090005">
+      <w:start w:val="1"/>
+      <w:numFmt w:val="bullet"/>
+      <w:lvlText w:val=""/>
+      <w:lvlJc w:val="left"/>
+      <w:pPr>
+        <w:ind w:hanging="360" w:left="6480"/>
+      </w:pPr>
+      <w:rPr>
+        <w:rFonts w:ascii="Wingdings" w:hAnsi="Wingdings" w:hint="default"/>
+      </w:rPr>
+    </w:lvl>
+  </w:abstractNum>
+  <w:abstractNum w15:restartNumberingAfterBreak="0" w:abstractNumId="7">
+    <w:nsid w:val="7EF31413"/>
+    <w:multiLevelType w:val="hybridMultilevel"/>
+    <w:tmpl w:val="061E1916"/>
+    <w:lvl w:ilvl="0" w:tplc="04090001">
+      <w:start w:val="1"/>
+      <w:numFmt w:val="bullet"/>
+      <w:lvlText w:val=""/>
+      <w:lvlJc w:val="left"/>
+      <w:pPr>
+        <w:ind w:hanging="360" w:left="720"/>
+      </w:pPr>
+      <w:rPr>
+        <w:rFonts w:ascii="Symbol" w:hAnsi="Symbol" w:hint="default"/>
+      </w:rPr>
+    </w:lvl>
+    <w:lvl w:ilvl="1" w:tentative="1" w:tplc="FFFFFFFF">
+      <w:start w:val="1"/>
+      <w:numFmt w:val="lowerLetter"/>
+      <w:lvlText w:val="%2."/>
+      <w:lvlJc w:val="left"/>
+      <w:pPr>
+        <w:ind w:hanging="360" w:left="1440"/>
+      </w:pPr>
+    </w:lvl>
+    <w:lvl w:ilvl="2" w:tentative="1" w:tplc="FFFFFFFF">
+      <w:start w:val="1"/>
+      <w:numFmt w:val="lowerRoman"/>
+      <w:lvlText w:val="%3."/>
+      <w:lvlJc w:val="right"/>
+      <w:pPr>
+        <w:ind w:hanging="180" w:left="2160"/>
+      </w:pPr>
+    </w:lvl>
+    <w:lvl w:ilvl="3" w:tentative="1" w:tplc="FFFFFFFF">
+      <w:start w:val="1"/>
+      <w:numFmt w:val="decimal"/>
+      <w:lvlText w:val="%4."/>
+      <w:lvlJc w:val="left"/>
+      <w:pPr>
+        <w:ind w:hanging="360" w:left="2880"/>
+      </w:pPr>
+    </w:lvl>
+    <w:lvl w:ilvl="4" w:tentative="1" w:tplc="FFFFFFFF">
+      <w:start w:val="1"/>
+      <w:numFmt w:val="lowerLetter"/>
+      <w:lvlText w:val="%5."/>
+      <w:lvlJc w:val="left"/>
+      <w:pPr>
+        <w:ind w:hanging="360" w:left="3600"/>
+      </w:pPr>
+    </w:lvl>
+    <w:lvl w:ilvl="5" w:tentative="1" w:tplc="FFFFFFFF">
+      <w:start w:val="1"/>
+      <w:numFmt w:val="lowerRoman"/>
+      <w:lvlText w:val="%6."/>
+      <w:lvlJc w:val="right"/>
+      <w:pPr>
+        <w:ind w:hanging="180" w:left="4320"/>
+      </w:pPr>
+    </w:lvl>
+    <w:lvl w:ilvl="6" w:tentative="1" w:tplc="FFFFFFFF">
+      <w:start w:val="1"/>
+      <w:numFmt w:val="decimal"/>
+      <w:lvlText w:val="%7."/>
+      <w:lvlJc w:val="left"/>
+      <w:pPr>
+        <w:ind w:hanging="360" w:left="5040"/>
+      </w:pPr>
+    </w:lvl>
+    <w:lvl w:ilvl="7" w:tentative="1" w:tplc="FFFFFFFF">
+      <w:start w:val="1"/>
+      <w:numFmt w:val="lowerLetter"/>
+      <w:lvlText w:val="%8."/>
+      <w:lvlJc w:val="left"/>
+      <w:pPr>
+        <w:ind w:hanging="360" w:left="5760"/>
+      </w:pPr>
+    </w:lvl>
+    <w:lvl w:ilvl="8" w:tentative="1" w:tplc="FFFFFFFF">
+      <w:start w:val="1"/>
+      <w:numFmt w:val="lowerRoman"/>
+      <w:lvlText w:val="%9."/>
+      <w:lvlJc w:val="right"/>
+      <w:pPr>
+        <w:ind w:hanging="180" w:left="6480"/>
+      </w:pPr>
+    </w:lvl>
+  </w:abstractNum>
   <w:abstractNum w:abstractNumId="990">
     <w:nsid w:val="0000A990"/>
     <w:multiLevelType w:val="multilevel"/>
@@ -3439,6 +4318,30 @@
       </w:pPr>
     </w:lvl>
   </w:abstractNum>
+  <w:num w16cid:durableId="1038243658" w:numId="1">
+    <w:abstractNumId w:val="3"/>
+  </w:num>
+  <w:num w16cid:durableId="1565873294" w:numId="2">
+    <w:abstractNumId w:val="7"/>
+  </w:num>
+  <w:num w16cid:durableId="267736538" w:numId="3">
+    <w:abstractNumId w:val="0"/>
+  </w:num>
+  <w:num w16cid:durableId="1398287614" w:numId="4">
+    <w:abstractNumId w:val="2"/>
+  </w:num>
+  <w:num w16cid:durableId="1141000816" w:numId="5">
+    <w:abstractNumId w:val="6"/>
+  </w:num>
+  <w:num w16cid:durableId="1012145028" w:numId="6">
+    <w:abstractNumId w:val="4"/>
+  </w:num>
+  <w:num w16cid:durableId="1060323516" w:numId="7">
+    <w:abstractNumId w:val="1"/>
+  </w:num>
+  <w:num w16cid:durableId="1050611009" w:numId="8">
+    <w:abstractNumId w:val="5"/>
+  </w:num>
   <w:num w:numId="1000">
     <w:abstractNumId w:val="990"/>
   </w:num>
@@ -3494,191 +4397,415 @@
 </file>
 
 <file path=word/styles.xml><?xml version="1.0" encoding="utf-8"?>
-<w:styles xmlns:r="http://schemas.openxmlformats.org/officeDocument/2006/relationships" xmlns:w="http://schemas.openxmlformats.org/wordprocessingml/2006/main">
+<w:styles xmlns:mc="http://schemas.openxmlformats.org/markup-compatibility/2006" xmlns:r="http://schemas.openxmlformats.org/officeDocument/2006/relationships" xmlns:w="http://schemas.openxmlformats.org/wordprocessingml/2006/main" xmlns:w14="http://schemas.microsoft.com/office/word/2010/wordml" xmlns:w15="http://schemas.microsoft.com/office/word/2012/wordml" xmlns:w16="http://schemas.microsoft.com/office/word/2018/wordml" xmlns:w16cex="http://schemas.microsoft.com/office/word/2018/wordml/cex" xmlns:w16cid="http://schemas.microsoft.com/office/word/2016/wordml/cid" xmlns:w16du="http://schemas.microsoft.com/office/word/2023/wordml/word16du" xmlns:w16sdtdh="http://schemas.microsoft.com/office/word/2020/wordml/sdtdatahash" xmlns:w16sdtfl="http://schemas.microsoft.com/office/word/2024/wordml/sdtformatlock" xmlns:w16se="http://schemas.microsoft.com/office/word/2015/wordml/symex" mc:Ignorable="w14 w15 w16se w16cid w16 w16cex w16sdtdh w16sdtfl w16du">
   <w:docDefaults>
     <w:rPrDefault>
       <w:rPr>
-        <w:rFonts w:asciiTheme="minorHAnsi" w:cstheme="minorBidi" w:eastAsiaTheme="minorEastAsia" w:hAnsiTheme="minorHAnsi"/>
+        <w:rFonts w:asciiTheme="minorHAnsi" w:cstheme="minorBidi" w:eastAsiaTheme="minorHAnsi" w:hAnsiTheme="minorHAnsi"/>
+        <w:kern w:val="2"/>
         <w:sz w:val="24"/>
         <w:szCs w:val="24"/>
-        <w:lang w:bidi="ar-SA" w:eastAsia="zh-CN" w:val="es"/>
+        <w:lang w:bidi="ar-SA" w:eastAsia="en-US" w:val="es"/>
+        <w14:ligatures w14:val="standardContextual"/>
       </w:rPr>
     </w:rPrDefault>
     <w:pPrDefault>
       <w:pPr>
-        <w:spacing w:after="200"/>
+        <w:spacing w:after="160" w:line="278" w:lineRule="auto"/>
       </w:pPr>
     </w:pPrDefault>
   </w:docDefaults>
-  <w:latentStyles w:count="276" w:defLockedState="0" w:defQFormat="0" w:defSemiHidden="0" w:defUIPriority="0" w:defUnhideWhenUsed="0"/>
+  <w:latentStyles w:count="376" w:defLockedState="0" w:defQFormat="0" w:defSemiHidden="0" w:defUIPriority="99" w:defUnhideWhenUsed="0">
+    <w:lsdException w:name="Normal" w:qFormat="1" w:uiPriority="0"/>
+    <w:lsdException w:name="heading 1" w:qFormat="1" w:uiPriority="9"/>
+    <w:lsdException w:name="heading 2" w:qFormat="1" w:semiHidden="1" w:uiPriority="9" w:unhideWhenUsed="1"/>
+    <w:lsdException w:name="heading 3" w:qFormat="1" w:semiHidden="1" w:uiPriority="9" w:unhideWhenUsed="1"/>
+    <w:lsdException w:name="heading 4" w:qFormat="1" w:semiHidden="1" w:uiPriority="9" w:unhideWhenUsed="1"/>
+    <w:lsdException w:name="heading 5" w:qFormat="1" w:semiHidden="1" w:uiPriority="9" w:unhideWhenUsed="1"/>
+    <w:lsdException w:name="heading 6" w:qFormat="1" w:semiHidden="1" w:uiPriority="9" w:unhideWhenUsed="1"/>
+    <w:lsdException w:name="heading 7" w:qFormat="1" w:semiHidden="1" w:uiPriority="9" w:unhideWhenUsed="1"/>
+    <w:lsdException w:name="heading 8" w:qFormat="1" w:semiHidden="1" w:uiPriority="9" w:unhideWhenUsed="1"/>
+    <w:lsdException w:name="heading 9" w:qFormat="1" w:semiHidden="1" w:uiPriority="9" w:unhideWhenUsed="1"/>
+    <w:lsdException w:name="index 1" w:semiHidden="1" w:unhideWhenUsed="1"/>
+    <w:lsdException w:name="index 2" w:semiHidden="1" w:unhideWhenUsed="1"/>
+    <w:lsdException w:name="index 3" w:semiHidden="1" w:unhideWhenUsed="1"/>
+    <w:lsdException w:name="index 4" w:semiHidden="1" w:unhideWhenUsed="1"/>
+    <w:lsdException w:name="index 5" w:semiHidden="1" w:unhideWhenUsed="1"/>
+    <w:lsdException w:name="index 6" w:semiHidden="1" w:unhideWhenUsed="1"/>
+    <w:lsdException w:name="index 7" w:semiHidden="1" w:unhideWhenUsed="1"/>
+    <w:lsdException w:name="index 8" w:semiHidden="1" w:unhideWhenUsed="1"/>
+    <w:lsdException w:name="index 9" w:semiHidden="1" w:unhideWhenUsed="1"/>
+    <w:lsdException w:name="toc 1" w:semiHidden="1" w:uiPriority="39" w:unhideWhenUsed="1"/>
+    <w:lsdException w:name="toc 2" w:semiHidden="1" w:uiPriority="39" w:unhideWhenUsed="1"/>
+    <w:lsdException w:name="toc 3" w:semiHidden="1" w:uiPriority="39" w:unhideWhenUsed="1"/>
+    <w:lsdException w:name="toc 4" w:semiHidden="1" w:uiPriority="39" w:unhideWhenUsed="1"/>
+    <w:lsdException w:name="toc 5" w:semiHidden="1" w:uiPriority="39" w:unhideWhenUsed="1"/>
+    <w:lsdException w:name="toc 6" w:semiHidden="1" w:uiPriority="39" w:unhideWhenUsed="1"/>
+    <w:lsdException w:name="toc 7" w:semiHidden="1" w:uiPriority="39" w:unhideWhenUsed="1"/>
+    <w:lsdException w:name="toc 8" w:semiHidden="1" w:uiPriority="39" w:unhideWhenUsed="1"/>
+    <w:lsdException w:name="toc 9" w:semiHidden="1" w:uiPriority="39" w:unhideWhenUsed="1"/>
+    <w:lsdException w:name="Normal Indent" w:semiHidden="1" w:unhideWhenUsed="1"/>
+    <w:lsdException w:name="footnote text" w:semiHidden="1" w:unhideWhenUsed="1"/>
+    <w:lsdException w:name="annotation text" w:semiHidden="1" w:unhideWhenUsed="1"/>
+    <w:lsdException w:name="header" w:semiHidden="1" w:unhideWhenUsed="1"/>
+    <w:lsdException w:name="footer" w:semiHidden="1" w:unhideWhenUsed="1"/>
+    <w:lsdException w:name="index heading" w:semiHidden="1" w:unhideWhenUsed="1"/>
+    <w:lsdException w:name="caption" w:qFormat="1" w:semiHidden="1" w:uiPriority="35" w:unhideWhenUsed="1"/>
+    <w:lsdException w:name="table of figures" w:semiHidden="1" w:unhideWhenUsed="1"/>
+    <w:lsdException w:name="envelope address" w:semiHidden="1" w:unhideWhenUsed="1"/>
+    <w:lsdException w:name="envelope return" w:semiHidden="1" w:unhideWhenUsed="1"/>
+    <w:lsdException w:name="footnote reference" w:semiHidden="1" w:unhideWhenUsed="1"/>
+    <w:lsdException w:name="annotation reference" w:semiHidden="1" w:unhideWhenUsed="1"/>
+    <w:lsdException w:name="line number" w:semiHidden="1" w:unhideWhenUsed="1"/>
+    <w:lsdException w:name="page number" w:semiHidden="1" w:unhideWhenUsed="1"/>
+    <w:lsdException w:name="endnote reference" w:semiHidden="1" w:unhideWhenUsed="1"/>
+    <w:lsdException w:name="endnote text" w:semiHidden="1" w:unhideWhenUsed="1"/>
+    <w:lsdException w:name="table of authorities" w:semiHidden="1" w:unhideWhenUsed="1"/>
+    <w:lsdException w:name="macro" w:semiHidden="1" w:unhideWhenUsed="1"/>
+    <w:lsdException w:name="toa heading" w:semiHidden="1" w:unhideWhenUsed="1"/>
+    <w:lsdException w:name="List" w:semiHidden="1" w:unhideWhenUsed="1"/>
+    <w:lsdException w:name="List Bullet" w:semiHidden="1" w:unhideWhenUsed="1"/>
+    <w:lsdException w:name="List Number" w:semiHidden="1" w:unhideWhenUsed="1"/>
+    <w:lsdException w:name="List 2" w:semiHidden="1" w:unhideWhenUsed="1"/>
+    <w:lsdException w:name="List 3" w:semiHidden="1" w:unhideWhenUsed="1"/>
+    <w:lsdException w:name="List 4" w:semiHidden="1" w:unhideWhenUsed="1"/>
+    <w:lsdException w:name="List 5" w:semiHidden="1" w:unhideWhenUsed="1"/>
+    <w:lsdException w:name="List Bullet 2" w:semiHidden="1" w:unhideWhenUsed="1"/>
+    <w:lsdException w:name="List Bullet 3" w:semiHidden="1" w:unhideWhenUsed="1"/>
+    <w:lsdException w:name="List Bullet 4" w:semiHidden="1" w:unhideWhenUsed="1"/>
+    <w:lsdException w:name="List Bullet 5" w:semiHidden="1" w:unhideWhenUsed="1"/>
+    <w:lsdException w:name="List Number 2" w:semiHidden="1" w:unhideWhenUsed="1"/>
+    <w:lsdException w:name="List Number 3" w:semiHidden="1" w:unhideWhenUsed="1"/>
+    <w:lsdException w:name="List Number 4" w:semiHidden="1" w:unhideWhenUsed="1"/>
+    <w:lsdException w:name="List Number 5" w:semiHidden="1" w:unhideWhenUsed="1"/>
+    <w:lsdException w:name="Title" w:qFormat="1" w:uiPriority="10"/>
+    <w:lsdException w:name="Closing" w:semiHidden="1" w:unhideWhenUsed="1"/>
+    <w:lsdException w:name="Signature" w:semiHidden="1" w:unhideWhenUsed="1"/>
+    <w:lsdException w:name="Default Paragraph Font" w:semiHidden="1" w:uiPriority="1" w:unhideWhenUsed="1"/>
+    <w:lsdException w:name="Body Text" w:semiHidden="1" w:unhideWhenUsed="1"/>
+    <w:lsdException w:name="Body Text Indent" w:semiHidden="1" w:unhideWhenUsed="1"/>
+    <w:lsdException w:name="List Continue" w:semiHidden="1" w:unhideWhenUsed="1"/>
+    <w:lsdException w:name="List Continue 2" w:semiHidden="1" w:unhideWhenUsed="1"/>
+    <w:lsdException w:name="List Continue 3" w:semiHidden="1" w:unhideWhenUsed="1"/>
+    <w:lsdException w:name="List Continue 4" w:semiHidden="1" w:unhideWhenUsed="1"/>
+    <w:lsdException w:name="List Continue 5" w:semiHidden="1" w:unhideWhenUsed="1"/>
+    <w:lsdException w:name="Message Header" w:semiHidden="1" w:unhideWhenUsed="1"/>
+    <w:lsdException w:name="Subtitle" w:qFormat="1" w:uiPriority="11"/>
+    <w:lsdException w:name="Salutation" w:semiHidden="1" w:unhideWhenUsed="1"/>
+    <w:lsdException w:name="Date" w:semiHidden="1" w:unhideWhenUsed="1"/>
+    <w:lsdException w:name="Body Text First Indent" w:semiHidden="1" w:unhideWhenUsed="1"/>
+    <w:lsdException w:name="Body Text First Indent 2" w:semiHidden="1" w:unhideWhenUsed="1"/>
+    <w:lsdException w:name="Note Heading" w:semiHidden="1" w:unhideWhenUsed="1"/>
+    <w:lsdException w:name="Body Text 2" w:semiHidden="1" w:unhideWhenUsed="1"/>
+    <w:lsdException w:name="Body Text 3" w:semiHidden="1" w:unhideWhenUsed="1"/>
+    <w:lsdException w:name="Body Text Indent 2" w:semiHidden="1" w:unhideWhenUsed="1"/>
+    <w:lsdException w:name="Body Text Indent 3" w:semiHidden="1" w:unhideWhenUsed="1"/>
+    <w:lsdException w:name="Block Text" w:semiHidden="1" w:unhideWhenUsed="1"/>
+    <w:lsdException w:name="Hyperlink" w:semiHidden="1" w:unhideWhenUsed="1"/>
+    <w:lsdException w:name="FollowedHyperlink" w:semiHidden="1" w:unhideWhenUsed="1"/>
+    <w:lsdException w:name="Strong" w:qFormat="1" w:uiPriority="22"/>
+    <w:lsdException w:name="Emphasis" w:qFormat="1" w:uiPriority="20"/>
+    <w:lsdException w:name="Document Map" w:semiHidden="1" w:unhideWhenUsed="1"/>
+    <w:lsdException w:name="Plain Text" w:semiHidden="1" w:unhideWhenUsed="1"/>
+    <w:lsdException w:name="E-mail Signature" w:semiHidden="1" w:unhideWhenUsed="1"/>
+    <w:lsdException w:name="HTML Top of Form" w:semiHidden="1" w:unhideWhenUsed="1"/>
+    <w:lsdException w:name="HTML Bottom of Form" w:semiHidden="1" w:unhideWhenUsed="1"/>
+    <w:lsdException w:name="Normal (Web)" w:semiHidden="1" w:unhideWhenUsed="1"/>
+    <w:lsdException w:name="HTML Acronym" w:semiHidden="1" w:unhideWhenUsed="1"/>
+    <w:lsdException w:name="HTML Address" w:semiHidden="1" w:unhideWhenUsed="1"/>
+    <w:lsdException w:name="HTML Cite" w:semiHidden="1" w:unhideWhenUsed="1"/>
+    <w:lsdException w:name="HTML Code" w:semiHidden="1" w:unhideWhenUsed="1"/>
+    <w:lsdException w:name="HTML Definition" w:semiHidden="1" w:unhideWhenUsed="1"/>
+    <w:lsdException w:name="HTML Keyboard" w:semiHidden="1" w:unhideWhenUsed="1"/>
+    <w:lsdException w:name="HTML Preformatted" w:semiHidden="1" w:unhideWhenUsed="1"/>
+    <w:lsdException w:name="HTML Sample" w:semiHidden="1" w:unhideWhenUsed="1"/>
+    <w:lsdException w:name="HTML Typewriter" w:semiHidden="1" w:unhideWhenUsed="1"/>
+    <w:lsdException w:name="HTML Variable" w:semiHidden="1" w:unhideWhenUsed="1"/>
+    <w:lsdException w:name="Normal Table" w:semiHidden="1" w:unhideWhenUsed="1"/>
+    <w:lsdException w:name="annotation subject" w:semiHidden="1" w:unhideWhenUsed="1"/>
+    <w:lsdException w:name="No List" w:semiHidden="1" w:unhideWhenUsed="1"/>
+    <w:lsdException w:name="Outline List 1" w:semiHidden="1" w:unhideWhenUsed="1"/>
+    <w:lsdException w:name="Outline List 2" w:semiHidden="1" w:unhideWhenUsed="1"/>
+    <w:lsdException w:name="Outline List 3" w:semiHidden="1" w:unhideWhenUsed="1"/>
+    <w:lsdException w:name="Table Simple 1" w:semiHidden="1" w:unhideWhenUsed="1"/>
+    <w:lsdException w:name="Table Simple 2" w:semiHidden="1" w:unhideWhenUsed="1"/>
+    <w:lsdException w:name="Table Simple 3" w:semiHidden="1" w:unhideWhenUsed="1"/>
+    <w:lsdException w:name="Table Classic 1" w:semiHidden="1" w:unhideWhenUsed="1"/>
+    <w:lsdException w:name="Table Classic 2" w:semiHidden="1" w:unhideWhenUsed="1"/>
+    <w:lsdException w:name="Table Classic 3" w:semiHidden="1" w:unhideWhenUsed="1"/>
+    <w:lsdException w:name="Table Classic 4" w:semiHidden="1" w:unhideWhenUsed="1"/>
+    <w:lsdException w:name="Table Colorful 1" w:semiHidden="1" w:unhideWhenUsed="1"/>
+    <w:lsdException w:name="Table Colorful 2" w:semiHidden="1" w:unhideWhenUsed="1"/>
+    <w:lsdException w:name="Table Colorful 3" w:semiHidden="1" w:unhideWhenUsed="1"/>
+    <w:lsdException w:name="Table Columns 1" w:semiHidden="1" w:unhideWhenUsed="1"/>
+    <w:lsdException w:name="Table Columns 2" w:semiHidden="1" w:unhideWhenUsed="1"/>
+    <w:lsdException w:name="Table Columns 3" w:semiHidden="1" w:unhideWhenUsed="1"/>
+    <w:lsdException w:name="Table Columns 4" w:semiHidden="1" w:unhideWhenUsed="1"/>
+    <w:lsdException w:name="Table Columns 5" w:semiHidden="1" w:unhideWhenUsed="1"/>
+    <w:lsdException w:name="Table Grid 1" w:semiHidden="1" w:unhideWhenUsed="1"/>
+    <w:lsdException w:name="Table Grid 2" w:semiHidden="1" w:unhideWhenUsed="1"/>
+    <w:lsdException w:name="Table Grid 3" w:semiHidden="1" w:unhideWhenUsed="1"/>
+    <w:lsdException w:name="Table Grid 4" w:semiHidden="1" w:unhideWhenUsed="1"/>
+    <w:lsdException w:name="Table Grid 5" w:semiHidden="1" w:unhideWhenUsed="1"/>
+    <w:lsdException w:name="Table Grid 6" w:semiHidden="1" w:unhideWhenUsed="1"/>
+    <w:lsdException w:name="Table Grid 7" w:semiHidden="1" w:unhideWhenUsed="1"/>
+    <w:lsdException w:name="Table Grid 8" w:semiHidden="1" w:unhideWhenUsed="1"/>
+    <w:lsdException w:name="Table List 1" w:semiHidden="1" w:unhideWhenUsed="1"/>
+    <w:lsdException w:name="Table List 2" w:semiHidden="1" w:unhideWhenUsed="1"/>
+    <w:lsdException w:name="Table List 3" w:semiHidden="1" w:unhideWhenUsed="1"/>
+    <w:lsdException w:name="Table List 4" w:semiHidden="1" w:unhideWhenUsed="1"/>
+    <w:lsdException w:name="Table List 5" w:semiHidden="1" w:unhideWhenUsed="1"/>
+    <w:lsdException w:name="Table List 6" w:semiHidden="1" w:unhideWhenUsed="1"/>
+    <w:lsdException w:name="Table List 7" w:semiHidden="1" w:unhideWhenUsed="1"/>
+    <w:lsdException w:name="Table List 8" w:semiHidden="1" w:unhideWhenUsed="1"/>
+    <w:lsdException w:name="Table 3D effects 1" w:semiHidden="1" w:unhideWhenUsed="1"/>
+    <w:lsdException w:name="Table 3D effects 2" w:semiHidden="1" w:unhideWhenUsed="1"/>
+    <w:lsdException w:name="Table 3D effects 3" w:semiHidden="1" w:unhideWhenUsed="1"/>
+    <w:lsdException w:name="Table Contemporary" w:semiHidden="1" w:unhideWhenUsed="1"/>
+    <w:lsdException w:name="Table Elegant" w:semiHidden="1" w:unhideWhenUsed="1"/>
+    <w:lsdException w:name="Table Professional" w:semiHidden="1" w:unhideWhenUsed="1"/>
+    <w:lsdException w:name="Table Subtle 1" w:semiHidden="1" w:unhideWhenUsed="1"/>
+    <w:lsdException w:name="Table Subtle 2" w:semiHidden="1" w:unhideWhenUsed="1"/>
+    <w:lsdException w:name="Table Web 1" w:semiHidden="1" w:unhideWhenUsed="1"/>
+    <w:lsdException w:name="Table Web 2" w:semiHidden="1" w:unhideWhenUsed="1"/>
+    <w:lsdException w:name="Table Web 3" w:semiHidden="1" w:unhideWhenUsed="1"/>
+    <w:lsdException w:name="Balloon Text" w:semiHidden="1" w:unhideWhenUsed="1"/>
+    <w:lsdException w:name="Table Grid" w:uiPriority="39"/>
+    <w:lsdException w:name="Table Theme" w:semiHidden="1" w:unhideWhenUsed="1"/>
+    <w:lsdException w:name="Placeholder Text" w:semiHidden="1"/>
+    <w:lsdException w:name="No Spacing" w:qFormat="1" w:uiPriority="1"/>
+    <w:lsdException w:name="Light Shading" w:uiPriority="60"/>
+    <w:lsdException w:name="Light List" w:uiPriority="61"/>
+    <w:lsdException w:name="Light Grid" w:uiPriority="62"/>
+    <w:lsdException w:name="Medium Shading 1" w:uiPriority="63"/>
+    <w:lsdException w:name="Medium Shading 2" w:uiPriority="64"/>
+    <w:lsdException w:name="Medium List 1" w:uiPriority="65"/>
+    <w:lsdException w:name="Medium List 2" w:uiPriority="66"/>
+    <w:lsdException w:name="Medium Grid 1" w:uiPriority="67"/>
+    <w:lsdException w:name="Medium Grid 2" w:uiPriority="68"/>
+    <w:lsdException w:name="Medium Grid 3" w:uiPriority="69"/>
+    <w:lsdException w:name="Dark List" w:uiPriority="70"/>
+    <w:lsdException w:name="Colorful Shading" w:uiPriority="71"/>
+    <w:lsdException w:name="Colorful List" w:uiPriority="72"/>
+    <w:lsdException w:name="Colorful Grid" w:uiPriority="73"/>
+    <w:lsdException w:name="Light Shading Accent 1" w:uiPriority="60"/>
+    <w:lsdException w:name="Light List Accent 1" w:uiPriority="61"/>
+    <w:lsdException w:name="Light Grid Accent 1" w:uiPriority="62"/>
+    <w:lsdException w:name="Medium Shading 1 Accent 1" w:uiPriority="63"/>
+    <w:lsdException w:name="Medium Shading 2 Accent 1" w:uiPriority="64"/>
+    <w:lsdException w:name="Medium List 1 Accent 1" w:uiPriority="65"/>
+    <w:lsdException w:name="Revision" w:semiHidden="1"/>
+    <w:lsdException w:name="List Paragraph" w:qFormat="1" w:uiPriority="34"/>
+    <w:lsdException w:name="Quote" w:qFormat="1" w:uiPriority="29"/>
+    <w:lsdException w:name="Intense Quote" w:qFormat="1" w:uiPriority="30"/>
+    <w:lsdException w:name="Medium List 2 Accent 1" w:uiPriority="66"/>
+    <w:lsdException w:name="Medium Grid 1 Accent 1" w:uiPriority="67"/>
+    <w:lsdException w:name="Medium Grid 2 Accent 1" w:uiPriority="68"/>
+    <w:lsdException w:name="Medium Grid 3 Accent 1" w:uiPriority="69"/>
+    <w:lsdException w:name="Dark List Accent 1" w:uiPriority="70"/>
+    <w:lsdException w:name="Colorful Shading Accent 1" w:uiPriority="71"/>
+    <w:lsdException w:name="Colorful List Accent 1" w:uiPriority="72"/>
+    <w:lsdException w:name="Colorful Grid Accent 1" w:uiPriority="73"/>
+    <w:lsdException w:name="Light Shading Accent 2" w:uiPriority="60"/>
+    <w:lsdException w:name="Light List Accent 2" w:uiPriority="61"/>
+    <w:lsdException w:name="Light Grid Accent 2" w:uiPriority="62"/>
+    <w:lsdException w:name="Medium Shading 1 Accent 2" w:uiPriority="63"/>
+    <w:lsdException w:name="Medium Shading 2 Accent 2" w:uiPriority="64"/>
+    <w:lsdException w:name="Medium List 1 Accent 2" w:uiPriority="65"/>
+    <w:lsdException w:name="Medium List 2 Accent 2" w:uiPriority="66"/>
+    <w:lsdException w:name="Medium Grid 1 Accent 2" w:uiPriority="67"/>
+    <w:lsdException w:name="Medium Grid 2 Accent 2" w:uiPriority="68"/>
+    <w:lsdException w:name="Medium Grid 3 Accent 2" w:uiPriority="69"/>
+    <w:lsdException w:name="Dark List Accent 2" w:uiPriority="70"/>
+    <w:lsdException w:name="Colorful Shading Accent 2" w:uiPriority="71"/>
+    <w:lsdException w:name="Colorful List Accent 2" w:uiPriority="72"/>
+    <w:lsdException w:name="Colorful Grid Accent 2" w:uiPriority="73"/>
+    <w:lsdException w:name="Light Shading Accent 3" w:uiPriority="60"/>
+    <w:lsdException w:name="Light List Accent 3" w:uiPriority="61"/>
+    <w:lsdException w:name="Light Grid Accent 3" w:uiPriority="62"/>
+    <w:lsdException w:name="Medium Shading 1 Accent 3" w:uiPriority="63"/>
+    <w:lsdException w:name="Medium Shading 2 Accent 3" w:uiPriority="64"/>
+    <w:lsdException w:name="Medium List 1 Accent 3" w:uiPriority="65"/>
+    <w:lsdException w:name="Medium List 2 Accent 3" w:uiPriority="66"/>
+    <w:lsdException w:name="Medium Grid 1 Accent 3" w:uiPriority="67"/>
+    <w:lsdException w:name="Medium Grid 2 Accent 3" w:uiPriority="68"/>
+    <w:lsdException w:name="Medium Grid 3 Accent 3" w:uiPriority="69"/>
+    <w:lsdException w:name="Dark List Accent 3" w:uiPriority="70"/>
+    <w:lsdException w:name="Colorful Shading Accent 3" w:uiPriority="71"/>
+    <w:lsdException w:name="Colorful List Accent 3" w:uiPriority="72"/>
+    <w:lsdException w:name="Colorful Grid Accent 3" w:uiPriority="73"/>
+    <w:lsdException w:name="Light Shading Accent 4" w:uiPriority="60"/>
+    <w:lsdException w:name="Light List Accent 4" w:uiPriority="61"/>
+    <w:lsdException w:name="Light Grid Accent 4" w:uiPriority="62"/>
+    <w:lsdException w:name="Medium Shading 1 Accent 4" w:uiPriority="63"/>
+    <w:lsdException w:name="Medium Shading 2 Accent 4" w:uiPriority="64"/>
+    <w:lsdException w:name="Medium List 1 Accent 4" w:uiPriority="65"/>
+    <w:lsdException w:name="Medium List 2 Accent 4" w:uiPriority="66"/>
+    <w:lsdException w:name="Medium Grid 1 Accent 4" w:uiPriority="67"/>
+    <w:lsdException w:name="Medium Grid 2 Accent 4" w:uiPriority="68"/>
+    <w:lsdException w:name="Medium Grid 3 Accent 4" w:uiPriority="69"/>
+    <w:lsdException w:name="Dark List Accent 4" w:uiPriority="70"/>
+    <w:lsdException w:name="Colorful Shading Accent 4" w:uiPriority="71"/>
+    <w:lsdException w:name="Colorful List Accent 4" w:uiPriority="72"/>
+    <w:lsdException w:name="Colorful Grid Accent 4" w:uiPriority="73"/>
+    <w:lsdException w:name="Light Shading Accent 5" w:uiPriority="60"/>
+    <w:lsdException w:name="Light List Accent 5" w:uiPriority="61"/>
+    <w:lsdException w:name="Light Grid Accent 5" w:uiPriority="62"/>
+    <w:lsdException w:name="Medium Shading 1 Accent 5" w:uiPriority="63"/>
+    <w:lsdException w:name="Medium Shading 2 Accent 5" w:uiPriority="64"/>
+    <w:lsdException w:name="Medium List 1 Accent 5" w:uiPriority="65"/>
+    <w:lsdException w:name="Medium List 2 Accent 5" w:uiPriority="66"/>
+    <w:lsdException w:name="Medium Grid 1 Accent 5" w:uiPriority="67"/>
+    <w:lsdException w:name="Medium Grid 2 Accent 5" w:uiPriority="68"/>
+    <w:lsdException w:name="Medium Grid 3 Accent 5" w:uiPriority="69"/>
+    <w:lsdException w:name="Dark List Accent 5" w:uiPriority="70"/>
+    <w:lsdException w:name="Colorful Shading Accent 5" w:uiPriority="71"/>
+    <w:lsdException w:name="Colorful List Accent 5" w:uiPriority="72"/>
+    <w:lsdException w:name="Colorful Grid Accent 5" w:uiPriority="73"/>
+    <w:lsdException w:name="Light Shading Accent 6" w:uiPriority="60"/>
+    <w:lsdException w:name="Light List Accent 6" w:uiPriority="61"/>
+    <w:lsdException w:name="Light Grid Accent 6" w:uiPriority="62"/>
+    <w:lsdException w:name="Medium Shading 1 Accent 6" w:uiPriority="63"/>
+    <w:lsdException w:name="Medium Shading 2 Accent 6" w:uiPriority="64"/>
+    <w:lsdException w:name="Medium List 1 Accent 6" w:uiPriority="65"/>
+    <w:lsdException w:name="Medium List 2 Accent 6" w:uiPriority="66"/>
+    <w:lsdException w:name="Medium Grid 1 Accent 6" w:uiPriority="67"/>
+    <w:lsdException w:name="Medium Grid 2 Accent 6" w:uiPriority="68"/>
+    <w:lsdException w:name="Medium Grid 3 Accent 6" w:uiPriority="69"/>
+    <w:lsdException w:name="Dark List Accent 6" w:uiPriority="70"/>
+    <w:lsdException w:name="Colorful Shading Accent 6" w:uiPriority="71"/>
+    <w:lsdException w:name="Colorful List Accent 6" w:uiPriority="72"/>
+    <w:lsdException w:name="Colorful Grid Accent 6" w:uiPriority="73"/>
+    <w:lsdException w:name="Subtle Emphasis" w:qFormat="1" w:uiPriority="19"/>
+    <w:lsdException w:name="Intense Emphasis" w:qFormat="1" w:uiPriority="21"/>
+    <w:lsdException w:name="Subtle Reference" w:qFormat="1" w:uiPriority="31"/>
+    <w:lsdException w:name="Intense Reference" w:qFormat="1" w:uiPriority="32"/>
+    <w:lsdException w:name="Book Title" w:qFormat="1" w:uiPriority="33"/>
+    <w:lsdException w:name="Bibliography" w:semiHidden="1" w:uiPriority="37" w:unhideWhenUsed="1"/>
+    <w:lsdException w:name="TOC Heading" w:qFormat="1" w:semiHidden="1" w:uiPriority="39" w:unhideWhenUsed="1"/>
+    <w:lsdException w:name="Plain Table 1" w:uiPriority="41"/>
+    <w:lsdException w:name="Plain Table 2" w:uiPriority="42"/>
+    <w:lsdException w:name="Plain Table 3" w:uiPriority="43"/>
+    <w:lsdException w:name="Plain Table 4" w:uiPriority="44"/>
+    <w:lsdException w:name="Plain Table 5" w:uiPriority="45"/>
+    <w:lsdException w:name="Grid Table Light" w:uiPriority="40"/>
+    <w:lsdException w:name="Grid Table 1 Light" w:uiPriority="46"/>
+    <w:lsdException w:name="Grid Table 2" w:uiPriority="47"/>
+    <w:lsdException w:name="Grid Table 3" w:uiPriority="48"/>
+    <w:lsdException w:name="Grid Table 4" w:uiPriority="49"/>
+    <w:lsdException w:name="Grid Table 5 Dark" w:uiPriority="50"/>
+    <w:lsdException w:name="Grid Table 6 Colorful" w:uiPriority="51"/>
+    <w:lsdException w:name="Grid Table 7 Colorful" w:uiPriority="52"/>
+    <w:lsdException w:name="Grid Table 1 Light Accent 1" w:uiPriority="46"/>
+    <w:lsdException w:name="Grid Table 2 Accent 1" w:uiPriority="47"/>
+    <w:lsdException w:name="Grid Table 3 Accent 1" w:uiPriority="48"/>
+    <w:lsdException w:name="Grid Table 4 Accent 1" w:uiPriority="49"/>
+    <w:lsdException w:name="Grid Table 5 Dark Accent 1" w:uiPriority="50"/>
+    <w:lsdException w:name="Grid Table 6 Colorful Accent 1" w:uiPriority="51"/>
+    <w:lsdException w:name="Grid Table 7 Colorful Accent 1" w:uiPriority="52"/>
+    <w:lsdException w:name="Grid Table 1 Light Accent 2" w:uiPriority="46"/>
+    <w:lsdException w:name="Grid Table 2 Accent 2" w:uiPriority="47"/>
+    <w:lsdException w:name="Grid Table 3 Accent 2" w:uiPriority="48"/>
+    <w:lsdException w:name="Grid Table 4 Accent 2" w:uiPriority="49"/>
+    <w:lsdException w:name="Grid Table 5 Dark Accent 2" w:uiPriority="50"/>
+    <w:lsdException w:name="Grid Table 6 Colorful Accent 2" w:uiPriority="51"/>
+    <w:lsdException w:name="Grid Table 7 Colorful Accent 2" w:uiPriority="52"/>
+    <w:lsdException w:name="Grid Table 1 Light Accent 3" w:uiPriority="46"/>
+    <w:lsdException w:name="Grid Table 2 Accent 3" w:uiPriority="47"/>
+    <w:lsdException w:name="Grid Table 3 Accent 3" w:uiPriority="48"/>
+    <w:lsdException w:name="Grid Table 4 Accent 3" w:uiPriority="49"/>
+    <w:lsdException w:name="Grid Table 5 Dark Accent 3" w:uiPriority="50"/>
+    <w:lsdException w:name="Grid Table 6 Colorful Accent 3" w:uiPriority="51"/>
+    <w:lsdException w:name="Grid Table 7 Colorful Accent 3" w:uiPriority="52"/>
+    <w:lsdException w:name="Grid Table 1 Light Accent 4" w:uiPriority="46"/>
+    <w:lsdException w:name="Grid Table 2 Accent 4" w:uiPriority="47"/>
+    <w:lsdException w:name="Grid Table 3 Accent 4" w:uiPriority="48"/>
+    <w:lsdException w:name="Grid Table 4 Accent 4" w:uiPriority="49"/>
+    <w:lsdException w:name="Grid Table 5 Dark Accent 4" w:uiPriority="50"/>
+    <w:lsdException w:name="Grid Table 6 Colorful Accent 4" w:uiPriority="51"/>
+    <w:lsdException w:name="Grid Table 7 Colorful Accent 4" w:uiPriority="52"/>
+    <w:lsdException w:name="Grid Table 1 Light Accent 5" w:uiPriority="46"/>
+    <w:lsdException w:name="Grid Table 2 Accent 5" w:uiPriority="47"/>
+    <w:lsdException w:name="Grid Table 3 Accent 5" w:uiPriority="48"/>
+    <w:lsdException w:name="Grid Table 4 Accent 5" w:uiPriority="49"/>
+    <w:lsdException w:name="Grid Table 5 Dark Accent 5" w:uiPriority="50"/>
+    <w:lsdException w:name="Grid Table 6 Colorful Accent 5" w:uiPriority="51"/>
+    <w:lsdException w:name="Grid Table 7 Colorful Accent 5" w:uiPriority="52"/>
+    <w:lsdException w:name="Grid Table 1 Light Accent 6" w:uiPriority="46"/>
+    <w:lsdException w:name="Grid Table 2 Accent 6" w:uiPriority="47"/>
+    <w:lsdException w:name="Grid Table 3 Accent 6" w:uiPriority="48"/>
+    <w:lsdException w:name="Grid Table 4 Accent 6" w:uiPriority="49"/>
+    <w:lsdException w:name="Grid Table 5 Dark Accent 6" w:uiPriority="50"/>
+    <w:lsdException w:name="Grid Table 6 Colorful Accent 6" w:uiPriority="51"/>
+    <w:lsdException w:name="Grid Table 7 Colorful Accent 6" w:uiPriority="52"/>
+    <w:lsdException w:name="List Table 1 Light" w:uiPriority="46"/>
+    <w:lsdException w:name="List Table 2" w:uiPriority="47"/>
+    <w:lsdException w:name="List Table 3" w:uiPriority="48"/>
+    <w:lsdException w:name="List Table 4" w:uiPriority="49"/>
+    <w:lsdException w:name="List Table 5 Dark" w:uiPriority="50"/>
+    <w:lsdException w:name="List Table 6 Colorful" w:uiPriority="51"/>
+    <w:lsdException w:name="List Table 7 Colorful" w:uiPriority="52"/>
+    <w:lsdException w:name="List Table 1 Light Accent 1" w:uiPriority="46"/>
+    <w:lsdException w:name="List Table 2 Accent 1" w:uiPriority="47"/>
+    <w:lsdException w:name="List Table 3 Accent 1" w:uiPriority="48"/>
+    <w:lsdException w:name="List Table 4 Accent 1" w:uiPriority="49"/>
+    <w:lsdException w:name="List Table 5 Dark Accent 1" w:uiPriority="50"/>
+    <w:lsdException w:name="List Table 6 Colorful Accent 1" w:uiPriority="51"/>
+    <w:lsdException w:name="List Table 7 Colorful Accent 1" w:uiPriority="52"/>
+    <w:lsdException w:name="List Table 1 Light Accent 2" w:uiPriority="46"/>
+    <w:lsdException w:name="List Table 2 Accent 2" w:uiPriority="47"/>
+    <w:lsdException w:name="List Table 3 Accent 2" w:uiPriority="48"/>
+    <w:lsdException w:name="List Table 4 Accent 2" w:uiPriority="49"/>
+    <w:lsdException w:name="List Table 5 Dark Accent 2" w:uiPriority="50"/>
+    <w:lsdException w:name="List Table 6 Colorful Accent 2" w:uiPriority="51"/>
+    <w:lsdException w:name="List Table 7 Colorful Accent 2" w:uiPriority="52"/>
+    <w:lsdException w:name="List Table 1 Light Accent 3" w:uiPriority="46"/>
+    <w:lsdException w:name="List Table 2 Accent 3" w:uiPriority="47"/>
+    <w:lsdException w:name="List Table 3 Accent 3" w:uiPriority="48"/>
+    <w:lsdException w:name="List Table 4 Accent 3" w:uiPriority="49"/>
+    <w:lsdException w:name="List Table 5 Dark Accent 3" w:uiPriority="50"/>
+    <w:lsdException w:name="List Table 6 Colorful Accent 3" w:uiPriority="51"/>
+    <w:lsdException w:name="List Table 7 Colorful Accent 3" w:uiPriority="52"/>
+    <w:lsdException w:name="List Table 1 Light Accent 4" w:uiPriority="46"/>
+    <w:lsdException w:name="List Table 2 Accent 4" w:uiPriority="47"/>
+    <w:lsdException w:name="List Table 3 Accent 4" w:uiPriority="48"/>
+    <w:lsdException w:name="List Table 4 Accent 4" w:uiPriority="49"/>
+    <w:lsdException w:name="List Table 5 Dark Accent 4" w:uiPriority="50"/>
+    <w:lsdException w:name="List Table 6 Colorful Accent 4" w:uiPriority="51"/>
+    <w:lsdException w:name="List Table 7 Colorful Accent 4" w:uiPriority="52"/>
+    <w:lsdException w:name="List Table 1 Light Accent 5" w:uiPriority="46"/>
+    <w:lsdException w:name="List Table 2 Accent 5" w:uiPriority="47"/>
+    <w:lsdException w:name="List Table 3 Accent 5" w:uiPriority="48"/>
+    <w:lsdException w:name="List Table 4 Accent 5" w:uiPriority="49"/>
+    <w:lsdException w:name="List Table 5 Dark Accent 5" w:uiPriority="50"/>
+    <w:lsdException w:name="List Table 6 Colorful Accent 5" w:uiPriority="51"/>
+    <w:lsdException w:name="List Table 7 Colorful Accent 5" w:uiPriority="52"/>
+    <w:lsdException w:name="List Table 1 Light Accent 6" w:uiPriority="46"/>
+    <w:lsdException w:name="List Table 2 Accent 6" w:uiPriority="47"/>
+    <w:lsdException w:name="List Table 3 Accent 6" w:uiPriority="48"/>
+    <w:lsdException w:name="List Table 4 Accent 6" w:uiPriority="49"/>
+    <w:lsdException w:name="List Table 5 Dark Accent 6" w:uiPriority="50"/>
+    <w:lsdException w:name="List Table 6 Colorful Accent 6" w:uiPriority="51"/>
+    <w:lsdException w:name="List Table 7 Colorful Accent 6" w:uiPriority="52"/>
+    <w:lsdException w:name="Mention" w:semiHidden="1" w:unhideWhenUsed="1"/>
+    <w:lsdException w:name="Smart Hyperlink" w:semiHidden="1" w:unhideWhenUsed="1"/>
+    <w:lsdException w:name="Hashtag" w:semiHidden="1" w:unhideWhenUsed="1"/>
+    <w:lsdException w:name="Unresolved Mention" w:semiHidden="1" w:unhideWhenUsed="1"/>
+    <w:lsdException w:name="Smart Link" w:semiHidden="1" w:unhideWhenUsed="1"/>
+  </w:latentStyles>
   <w:style w:default="1" w:styleId="Normal" w:type="paragraph">
     <w:name w:val="Normal"/>
     <w:qFormat/>
-  </w:style>
-  <w:style w:styleId="BodyText" w:type="paragraph">
-    <w:name w:val="Body Text"/>
-    <w:basedOn w:val="Normal"/>
-    <w:link w:val="BodyTextChar"/>
-    <w:qFormat/>
-    <w:pPr>
-      <w:spacing w:after="180" w:before="180"/>
-    </w:pPr>
-  </w:style>
-  <w:style w:customStyle="1" w:styleId="FirstParagraph" w:type="paragraph">
-    <w:name w:val="First Paragraph"/>
-    <w:basedOn w:val="BodyText"/>
-    <w:next w:val="BodyText"/>
-    <w:qFormat/>
-  </w:style>
-  <w:style w:customStyle="1" w:styleId="Compact" w:type="paragraph">
-    <w:name w:val="Compact"/>
-    <w:basedOn w:val="BodyText"/>
-    <w:qFormat/>
-    <w:pPr>
-      <w:spacing w:after="36" w:before="36"/>
-    </w:pPr>
-  </w:style>
-  <w:style w:styleId="Title" w:type="paragraph">
-    <w:name w:val="Title"/>
-    <w:basedOn w:val="Normal"/>
-    <w:next w:val="BodyText"/>
-    <w:link w:val="TitleChar"/>
-    <w:uiPriority w:val="10"/>
-    <w:qFormat/>
-    <w:rsid w:val="00A10FD9"/>
-    <w:pPr>
-      <w:spacing w:after="80" w:line="240" w:lineRule="auto"/>
-      <w:contextualSpacing/>
-      <w:jc w:val="center"/>
-    </w:pPr>
-    <w:rPr>
-      <w:rFonts w:asciiTheme="majorHAnsi" w:cstheme="majorBidi" w:eastAsiaTheme="majorEastAsia" w:hAnsiTheme="majorHAnsi"/>
-      <w:sz w:val="56"/>
-      <w:szCs w:val="56"/>
-    </w:rPr>
-  </w:style>
-  <w:style w:customStyle="1" w:styleId="TitleChar" w:type="character">
-    <w:name w:val="Title Char"/>
-    <w:basedOn w:val="DefaultParagraphFont"/>
-    <w:link w:val="Title"/>
-    <w:uiPriority w:val="10"/>
-    <w:rsid w:val="00A10FD9"/>
-    <w:rPr>
-      <w:rFonts w:asciiTheme="majorHAnsi" w:cstheme="majorBidi" w:eastAsiaTheme="majorEastAsia" w:hAnsiTheme="majorHAnsi"/>
-      <w:sz w:val="56"/>
-      <w:szCs w:val="56"/>
-    </w:rPr>
-  </w:style>
-  <w:style w:styleId="Subtitle" w:type="paragraph">
-    <w:name w:val="Subtitle"/>
-    <w:basedOn w:val="Title"/>
-    <w:next w:val="BodyText"/>
-    <w:link w:val="SubtitleChar"/>
-    <w:uiPriority w:val="11"/>
-    <w:qFormat/>
-    <w:rsid w:val="00A10FD9"/>
-    <w:pPr>
-      <w:numPr>
-        <w:ilvl w:val="1"/>
-      </w:numPr>
-    </w:pPr>
-    <w:rPr>
-      <w:rFonts w:cstheme="majorBidi" w:eastAsiaTheme="majorEastAsia"/>
-      <w:spacing w:val="15"/>
-      <w:sz w:val="28"/>
-      <w:szCs w:val="28"/>
-    </w:rPr>
-  </w:style>
-  <w:style w:customStyle="1" w:styleId="SubtitleChar" w:type="character">
-    <w:name w:val="Subtitle Char"/>
-    <w:basedOn w:val="DefaultParagraphFont"/>
-    <w:link w:val="Subtitle"/>
-    <w:uiPriority w:val="11"/>
-    <w:rsid w:val="00A10FD9"/>
-    <w:rPr>
-      <w:rFonts w:cstheme="majorBidi" w:eastAsiaTheme="majorEastAsia"/>
-      <w:color w:themeColor="text1" w:themeTint="A6" w:val="595959"/>
-      <w:spacing w:val="15"/>
-      <w:sz w:val="28"/>
-      <w:szCs w:val="28"/>
-    </w:rPr>
-  </w:style>
-  <w:style w:customStyle="1" w:styleId="Author" w:type="paragraph">
-    <w:name w:val="Author"/>
-    <w:basedOn w:val="Title"/>
-    <w:next w:val="BodyText"/>
-    <w:qFormat/>
-    <w:pPr>
-      <w:keepNext/>
-      <w:keepLines/>
-    </w:pPr>
-    <w:rPr>
-      <w:sz w:val="24"/>
-      <w:szCs w:val="24"/>
-    </w:rPr>
-  </w:style>
-  <w:style w:styleId="Date" w:type="paragraph">
-    <w:name w:val="Date"/>
-    <w:basedOn w:val="Title"/>
-    <w:next w:val="BodyText"/>
-    <w:qFormat/>
-    <w:pPr>
-      <w:keepNext/>
-      <w:keepLines/>
-    </w:pPr>
-    <w:rPr>
-      <w:sz w:val="24"/>
-      <w:szCs w:val="24"/>
-    </w:rPr>
-  </w:style>
-  <w:style w:customStyle="1" w:styleId="AbstractTitle" w:type="paragraph">
-    <w:name w:val="Abstract Title"/>
-    <w:basedOn w:val="Normal"/>
-    <w:next w:val="Abstract"/>
-    <w:qFormat/>
-    <w:pPr>
-      <w:keepNext/>
-      <w:keepLines/>
-      <w:spacing w:after="0" w:before="300"/>
-      <w:jc w:val="center"/>
-    </w:pPr>
-    <w:rPr>
-      <w:b/>
-      <w:sz w:val="20"/>
-      <w:szCs w:val="20"/>
-    </w:rPr>
-  </w:style>
-  <w:style w:customStyle="1" w:styleId="Abstract" w:type="paragraph">
-    <w:name w:val="Abstract"/>
-    <w:basedOn w:val="Normal"/>
-    <w:next w:val="BodyText"/>
-    <w:qFormat/>
-    <w:pPr>
-      <w:keepNext/>
-      <w:keepLines/>
-      <w:spacing w:after="300" w:before="100"/>
-    </w:pPr>
-    <w:rPr>
-      <w:sz w:val="20"/>
-      <w:szCs w:val="20"/>
-    </w:rPr>
-  </w:style>
-  <w:style w:styleId="Bibliography" w:type="paragraph">
-    <w:name w:val="Bibliography"/>
-    <w:basedOn w:val="Normal"/>
-    <w:next w:val="Bibliography"/>
-    <w:qFormat/>
-    <w:pPr/>
-    <w:rPr/>
+    <w:rsid w:val="00273429"/>
   </w:style>
   <w:style w:styleId="Heading1" w:type="paragraph">
     <w:name w:val="heading 1"/>
     <w:basedOn w:val="Normal"/>
-    <w:next w:val="BodyText"/>
+    <w:next w:val="Normal"/>
     <w:link w:val="Heading1Char"/>
     <w:uiPriority w:val="9"/>
     <w:qFormat/>
-    <w:rsid w:val="00A10FD9"/>
+    <w:rsid w:val="00273429"/>
     <w:pPr>
       <w:keepNext/>
       <w:keepLines/>
@@ -3687,7 +4814,7 @@
     </w:pPr>
     <w:rPr>
       <w:rFonts w:asciiTheme="majorHAnsi" w:cstheme="majorBidi" w:eastAsiaTheme="majorEastAsia" w:hAnsiTheme="majorHAnsi"/>
-      <w:color w:themeColor="accent1" w:themeShade="BF" w:val="0F4761"/>
+      <w:color w:themeColor="accent1" w:themeShade="BF" w:val="2F5496"/>
       <w:sz w:val="40"/>
       <w:szCs w:val="40"/>
     </w:rPr>
@@ -3695,13 +4822,13 @@
   <w:style w:styleId="Heading2" w:type="paragraph">
     <w:name w:val="heading 2"/>
     <w:basedOn w:val="Normal"/>
-    <w:next w:val="BodyText"/>
+    <w:next w:val="Normal"/>
     <w:link w:val="Heading2Char"/>
     <w:uiPriority w:val="9"/>
     <w:semiHidden/>
     <w:unhideWhenUsed/>
     <w:qFormat/>
-    <w:rsid w:val="00A10FD9"/>
+    <w:rsid w:val="00273429"/>
     <w:pPr>
       <w:keepNext/>
       <w:keepLines/>
@@ -3710,7 +4837,7 @@
     </w:pPr>
     <w:rPr>
       <w:rFonts w:asciiTheme="majorHAnsi" w:cstheme="majorBidi" w:eastAsiaTheme="majorEastAsia" w:hAnsiTheme="majorHAnsi"/>
-      <w:color w:themeColor="accent1" w:themeShade="BF" w:val="0F4761"/>
+      <w:color w:themeColor="accent1" w:themeShade="BF" w:val="2F5496"/>
       <w:sz w:val="32"/>
       <w:szCs w:val="32"/>
     </w:rPr>
@@ -3718,13 +4845,13 @@
   <w:style w:styleId="Heading3" w:type="paragraph">
     <w:name w:val="heading 3"/>
     <w:basedOn w:val="Normal"/>
-    <w:next w:val="BodyText"/>
+    <w:next w:val="Normal"/>
     <w:link w:val="Heading3Char"/>
     <w:uiPriority w:val="9"/>
     <w:semiHidden/>
     <w:unhideWhenUsed/>
     <w:qFormat/>
-    <w:rsid w:val="00A10FD9"/>
+    <w:rsid w:val="00273429"/>
     <w:pPr>
       <w:keepNext/>
       <w:keepLines/>
@@ -3733,7 +4860,7 @@
     </w:pPr>
     <w:rPr>
       <w:rFonts w:cstheme="majorBidi" w:eastAsiaTheme="majorEastAsia"/>
-      <w:color w:themeColor="accent1" w:themeShade="BF" w:val="0F4761"/>
+      <w:color w:themeColor="accent1" w:themeShade="BF" w:val="2F5496"/>
       <w:sz w:val="28"/>
       <w:szCs w:val="28"/>
     </w:rPr>
@@ -3741,13 +4868,13 @@
   <w:style w:styleId="Heading4" w:type="paragraph">
     <w:name w:val="heading 4"/>
     <w:basedOn w:val="Normal"/>
-    <w:next w:val="BodyText"/>
+    <w:next w:val="Normal"/>
     <w:link w:val="Heading4Char"/>
     <w:uiPriority w:val="9"/>
     <w:semiHidden/>
     <w:unhideWhenUsed/>
     <w:qFormat/>
-    <w:rsid w:val="00A10FD9"/>
+    <w:rsid w:val="00273429"/>
     <w:pPr>
       <w:keepNext/>
       <w:keepLines/>
@@ -3758,19 +4885,19 @@
       <w:rFonts w:cstheme="majorBidi" w:eastAsiaTheme="majorEastAsia"/>
       <w:i/>
       <w:iCs/>
-      <w:color w:themeColor="accent1" w:themeShade="BF" w:val="0F4761"/>
+      <w:color w:themeColor="accent1" w:themeShade="BF" w:val="2F5496"/>
     </w:rPr>
   </w:style>
   <w:style w:styleId="Heading5" w:type="paragraph">
     <w:name w:val="heading 5"/>
     <w:basedOn w:val="Normal"/>
-    <w:next w:val="BodyText"/>
+    <w:next w:val="Normal"/>
     <w:link w:val="Heading5Char"/>
     <w:uiPriority w:val="9"/>
     <w:semiHidden/>
     <w:unhideWhenUsed/>
     <w:qFormat/>
-    <w:rsid w:val="00A10FD9"/>
+    <w:rsid w:val="00273429"/>
     <w:pPr>
       <w:keepNext/>
       <w:keepLines/>
@@ -3779,19 +4906,19 @@
     </w:pPr>
     <w:rPr>
       <w:rFonts w:cstheme="majorBidi" w:eastAsiaTheme="majorEastAsia"/>
-      <w:color w:themeColor="accent1" w:themeShade="BF" w:val="0F4761"/>
+      <w:color w:themeColor="accent1" w:themeShade="BF" w:val="2F5496"/>
     </w:rPr>
   </w:style>
   <w:style w:styleId="Heading6" w:type="paragraph">
     <w:name w:val="heading 6"/>
     <w:basedOn w:val="Normal"/>
-    <w:next w:val="BodyText"/>
+    <w:next w:val="Normal"/>
     <w:link w:val="Heading6Char"/>
     <w:uiPriority w:val="9"/>
     <w:semiHidden/>
     <w:unhideWhenUsed/>
     <w:qFormat/>
-    <w:rsid w:val="00A10FD9"/>
+    <w:rsid w:val="00273429"/>
     <w:pPr>
       <w:keepNext/>
       <w:keepLines/>
@@ -3808,13 +4935,13 @@
   <w:style w:styleId="Heading7" w:type="paragraph">
     <w:name w:val="heading 7"/>
     <w:basedOn w:val="Normal"/>
-    <w:next w:val="BodyText"/>
+    <w:next w:val="Normal"/>
     <w:link w:val="Heading7Char"/>
     <w:uiPriority w:val="9"/>
     <w:semiHidden/>
     <w:unhideWhenUsed/>
     <w:qFormat/>
-    <w:rsid w:val="00A10FD9"/>
+    <w:rsid w:val="00273429"/>
     <w:pPr>
       <w:keepNext/>
       <w:keepLines/>
@@ -3829,13 +4956,13 @@
   <w:style w:styleId="Heading8" w:type="paragraph">
     <w:name w:val="heading 8"/>
     <w:basedOn w:val="Normal"/>
-    <w:next w:val="BodyText"/>
+    <w:next w:val="Normal"/>
     <w:link w:val="Heading8Char"/>
     <w:uiPriority w:val="9"/>
     <w:semiHidden/>
     <w:unhideWhenUsed/>
     <w:qFormat/>
-    <w:rsid w:val="00A10FD9"/>
+    <w:rsid w:val="00273429"/>
     <w:pPr>
       <w:keepNext/>
       <w:keepLines/>
@@ -3852,13 +4979,13 @@
   <w:style w:styleId="Heading9" w:type="paragraph">
     <w:name w:val="heading 9"/>
     <w:basedOn w:val="Normal"/>
-    <w:next w:val="BodyText"/>
+    <w:next w:val="Normal"/>
     <w:link w:val="Heading9Char"/>
     <w:uiPriority w:val="9"/>
     <w:semiHidden/>
     <w:unhideWhenUsed/>
     <w:qFormat/>
-    <w:rsid w:val="00A10FD9"/>
+    <w:rsid w:val="00273429"/>
     <w:pPr>
       <w:keepNext/>
       <w:keepLines/>
@@ -3870,168 +4997,17 @@
       <w:color w:themeColor="text1" w:themeTint="D8" w:val="272727"/>
     </w:rPr>
   </w:style>
-  <w:style w:customStyle="1" w:styleId="Heading1Char" w:type="character">
-    <w:name w:val="Heading 1 Char"/>
-    <w:basedOn w:val="DefaultParagraphFont"/>
-    <w:link w:val="Heading1"/>
-    <w:uiPriority w:val="9"/>
-    <w:rsid w:val="00A10FD9"/>
-    <w:rPr>
-      <w:rFonts w:asciiTheme="majorHAnsi" w:cstheme="majorBidi" w:eastAsiaTheme="majorEastAsia" w:hAnsiTheme="majorHAnsi"/>
-      <w:color w:themeColor="accent1" w:themeShade="BF" w:val="0F4761"/>
-      <w:sz w:val="40"/>
-      <w:szCs w:val="40"/>
-    </w:rPr>
-  </w:style>
-  <w:style w:customStyle="1" w:styleId="Heading2Char" w:type="character">
-    <w:name w:val="Heading 2 Char"/>
-    <w:basedOn w:val="DefaultParagraphFont"/>
-    <w:link w:val="Heading2"/>
-    <w:uiPriority w:val="9"/>
-    <w:semiHidden/>
-    <w:rsid w:val="00A10FD9"/>
-    <w:rPr>
-      <w:rFonts w:asciiTheme="majorHAnsi" w:cstheme="majorBidi" w:eastAsiaTheme="majorEastAsia" w:hAnsiTheme="majorHAnsi"/>
-      <w:color w:themeColor="accent1" w:themeShade="BF" w:val="0F4761"/>
-      <w:sz w:val="32"/>
-      <w:szCs w:val="32"/>
-    </w:rPr>
-  </w:style>
-  <w:style w:customStyle="1" w:styleId="Heading3Char" w:type="character">
-    <w:name w:val="Heading 3 Char"/>
-    <w:basedOn w:val="DefaultParagraphFont"/>
-    <w:link w:val="Heading3"/>
-    <w:uiPriority w:val="9"/>
-    <w:semiHidden/>
-    <w:rsid w:val="00A10FD9"/>
-    <w:rPr>
-      <w:rFonts w:cstheme="majorBidi" w:eastAsiaTheme="majorEastAsia"/>
-      <w:color w:themeColor="accent1" w:themeShade="BF" w:val="0F4761"/>
-      <w:sz w:val="28"/>
-      <w:szCs w:val="28"/>
-    </w:rPr>
-  </w:style>
-  <w:style w:customStyle="1" w:styleId="Heading4Char" w:type="character">
-    <w:name w:val="Heading 4 Char"/>
-    <w:basedOn w:val="DefaultParagraphFont"/>
-    <w:link w:val="Heading4"/>
-    <w:uiPriority w:val="9"/>
-    <w:semiHidden/>
-    <w:rsid w:val="00A10FD9"/>
-    <w:rPr>
-      <w:rFonts w:cstheme="majorBidi" w:eastAsiaTheme="majorEastAsia"/>
-      <w:i/>
-      <w:iCs/>
-      <w:color w:themeColor="accent1" w:themeShade="BF" w:val="0F4761"/>
-    </w:rPr>
-  </w:style>
-  <w:style w:customStyle="1" w:styleId="Heading5Char" w:type="character">
-    <w:name w:val="Heading 5 Char"/>
-    <w:basedOn w:val="DefaultParagraphFont"/>
-    <w:link w:val="Heading5"/>
-    <w:uiPriority w:val="9"/>
-    <w:semiHidden/>
-    <w:rsid w:val="00A10FD9"/>
-    <w:rPr>
-      <w:rFonts w:cstheme="majorBidi" w:eastAsiaTheme="majorEastAsia"/>
-      <w:color w:themeColor="accent1" w:themeShade="BF" w:val="0F4761"/>
-    </w:rPr>
-  </w:style>
-  <w:style w:customStyle="1" w:styleId="Heading6Char" w:type="character">
-    <w:name w:val="Heading 6 Char"/>
-    <w:basedOn w:val="DefaultParagraphFont"/>
-    <w:link w:val="Heading6"/>
-    <w:uiPriority w:val="9"/>
-    <w:semiHidden/>
-    <w:rsid w:val="00A10FD9"/>
-    <w:rPr>
-      <w:rFonts w:cstheme="majorBidi" w:eastAsiaTheme="majorEastAsia"/>
-      <w:i/>
-      <w:iCs/>
-      <w:color w:themeColor="text1" w:themeTint="A6" w:val="595959"/>
-    </w:rPr>
-  </w:style>
-  <w:style w:customStyle="1" w:styleId="Heading7Char" w:type="character">
-    <w:name w:val="Heading 7 Char"/>
-    <w:basedOn w:val="DefaultParagraphFont"/>
-    <w:link w:val="Heading7"/>
-    <w:uiPriority w:val="9"/>
-    <w:semiHidden/>
-    <w:rsid w:val="00A10FD9"/>
-    <w:rPr>
-      <w:rFonts w:cstheme="majorBidi" w:eastAsiaTheme="majorEastAsia"/>
-      <w:color w:themeColor="text1" w:themeTint="A6" w:val="595959"/>
-    </w:rPr>
-  </w:style>
-  <w:style w:customStyle="1" w:styleId="Heading8Char" w:type="character">
-    <w:name w:val="Heading 8 Char"/>
-    <w:basedOn w:val="DefaultParagraphFont"/>
-    <w:link w:val="Heading8"/>
-    <w:uiPriority w:val="9"/>
-    <w:semiHidden/>
-    <w:rsid w:val="00A10FD9"/>
-    <w:rPr>
-      <w:rFonts w:cstheme="majorBidi" w:eastAsiaTheme="majorEastAsia"/>
-      <w:i/>
-      <w:iCs/>
-      <w:color w:themeColor="text1" w:themeTint="D8" w:val="272727"/>
-    </w:rPr>
-  </w:style>
-  <w:style w:customStyle="1" w:styleId="Heading9Char" w:type="character">
-    <w:name w:val="Heading 9 Char"/>
-    <w:basedOn w:val="DefaultParagraphFont"/>
-    <w:link w:val="Heading9"/>
-    <w:uiPriority w:val="9"/>
-    <w:semiHidden/>
-    <w:rsid w:val="00A10FD9"/>
-    <w:rPr>
-      <w:rFonts w:cstheme="majorBidi" w:eastAsiaTheme="majorEastAsia"/>
-      <w:color w:themeColor="text1" w:themeTint="D8" w:val="272727"/>
-    </w:rPr>
-  </w:style>
-  <w:style w:styleId="BlockText" w:type="paragraph">
-    <w:name w:val="Block Text"/>
-    <w:basedOn w:val="BodyText"/>
-    <w:next w:val="BodyText"/>
-    <w:uiPriority w:val="9"/>
-    <w:unhideWhenUsed/>
-    <w:qFormat/>
-    <w:pPr>
-      <w:spacing w:after="100" w:before="100"/>
-      <w:ind w:firstLine="0" w:left="480" w:right="480"/>
-    </w:pPr>
-  </w:style>
-  <w:style w:styleId="FootnoteText" w:type="paragraph">
-    <w:name w:val="Footnote Text"/>
-    <w:basedOn w:val="Normal"/>
-    <w:next w:val="FootnoteText"/>
-    <w:uiPriority w:val="9"/>
-    <w:unhideWhenUsed/>
-    <w:qFormat/>
-  </w:style>
-  <w:style w:styleId="FootnoteBlockText" w:type="paragraph">
-    <w:name w:val="Footnote Block Text"/>
-    <w:basedOn w:val="FootnoteText"/>
-    <w:next w:val="FootnoteText"/>
-    <w:uiPriority w:val="9"/>
-    <w:unhideWhenUsed/>
-    <w:qFormat/>
-    <w:pPr>
-      <w:spacing w:after="100" w:before="100"/>
-      <w:ind w:firstLine="0" w:left="480" w:right="480"/>
-    </w:pPr>
-  </w:style>
   <w:style w:default="1" w:styleId="DefaultParagraphFont" w:type="character">
     <w:name w:val="Default Paragraph Font"/>
+    <w:uiPriority w:val="1"/>
     <w:semiHidden/>
     <w:unhideWhenUsed/>
   </w:style>
-  <w:style w:default="1" w:styleId="Table" w:type="table">
-    <w:name w:val="Table"/>
-    <w:basedOn w:val="TableNormal"/>
+  <w:style w:default="1" w:styleId="TableNormal" w:type="table">
+    <w:name w:val="Normal Table"/>
+    <w:uiPriority w:val="99"/>
     <w:semiHidden/>
     <w:unhideWhenUsed/>
-    <w:qFormat/>
     <w:tblPr>
       <w:tblInd w:type="dxa" w:w="0"/>
       <w:tblCellMar>
@@ -4041,113 +5017,321 @@
         <w:right w:type="dxa" w:w="108"/>
       </w:tblCellMar>
     </w:tblPr>
-    <w:tblStylePr w:type="firstRow">
-      <w:tcPr>
-        <w:tcBorders>
-          <w:bottom w:val="single"/>
-        </w:tcBorders>
-        <w:vAlign w:val="bottom"/>
-      </w:tcPr>
-    </w:tblStylePr>
-  </w:style>
-  <w:style w:customStyle="1" w:styleId="DefinitionTerm" w:type="paragraph">
-    <w:name w:val="Definition Term"/>
+  </w:style>
+  <w:style w:default="1" w:styleId="NoList" w:type="numbering">
+    <w:name w:val="No List"/>
+    <w:uiPriority w:val="99"/>
+    <w:semiHidden/>
+    <w:unhideWhenUsed/>
+  </w:style>
+  <w:style w:customStyle="1" w:styleId="Heading1Char" w:type="character">
+    <w:name w:val="Heading 1 Char"/>
+    <w:basedOn w:val="DefaultParagraphFont"/>
+    <w:link w:val="Heading1"/>
+    <w:uiPriority w:val="9"/>
+    <w:rsid w:val="00273429"/>
+    <w:rPr>
+      <w:rFonts w:asciiTheme="majorHAnsi" w:cstheme="majorBidi" w:eastAsiaTheme="majorEastAsia" w:hAnsiTheme="majorHAnsi"/>
+      <w:color w:themeColor="accent1" w:themeShade="BF" w:val="2F5496"/>
+      <w:sz w:val="40"/>
+      <w:szCs w:val="40"/>
+    </w:rPr>
+  </w:style>
+  <w:style w:customStyle="1" w:styleId="Heading2Char" w:type="character">
+    <w:name w:val="Heading 2 Char"/>
+    <w:basedOn w:val="DefaultParagraphFont"/>
+    <w:link w:val="Heading2"/>
+    <w:uiPriority w:val="9"/>
+    <w:semiHidden/>
+    <w:rsid w:val="00273429"/>
+    <w:rPr>
+      <w:rFonts w:asciiTheme="majorHAnsi" w:cstheme="majorBidi" w:eastAsiaTheme="majorEastAsia" w:hAnsiTheme="majorHAnsi"/>
+      <w:color w:themeColor="accent1" w:themeShade="BF" w:val="2F5496"/>
+      <w:sz w:val="32"/>
+      <w:szCs w:val="32"/>
+    </w:rPr>
+  </w:style>
+  <w:style w:customStyle="1" w:styleId="Heading3Char" w:type="character">
+    <w:name w:val="Heading 3 Char"/>
+    <w:basedOn w:val="DefaultParagraphFont"/>
+    <w:link w:val="Heading3"/>
+    <w:uiPriority w:val="9"/>
+    <w:semiHidden/>
+    <w:rsid w:val="00273429"/>
+    <w:rPr>
+      <w:rFonts w:cstheme="majorBidi" w:eastAsiaTheme="majorEastAsia"/>
+      <w:color w:themeColor="accent1" w:themeShade="BF" w:val="2F5496"/>
+      <w:sz w:val="28"/>
+      <w:szCs w:val="28"/>
+    </w:rPr>
+  </w:style>
+  <w:style w:customStyle="1" w:styleId="Heading4Char" w:type="character">
+    <w:name w:val="Heading 4 Char"/>
+    <w:basedOn w:val="DefaultParagraphFont"/>
+    <w:link w:val="Heading4"/>
+    <w:uiPriority w:val="9"/>
+    <w:semiHidden/>
+    <w:rsid w:val="00273429"/>
+    <w:rPr>
+      <w:rFonts w:cstheme="majorBidi" w:eastAsiaTheme="majorEastAsia"/>
+      <w:i/>
+      <w:iCs/>
+      <w:color w:themeColor="accent1" w:themeShade="BF" w:val="2F5496"/>
+    </w:rPr>
+  </w:style>
+  <w:style w:customStyle="1" w:styleId="Heading5Char" w:type="character">
+    <w:name w:val="Heading 5 Char"/>
+    <w:basedOn w:val="DefaultParagraphFont"/>
+    <w:link w:val="Heading5"/>
+    <w:uiPriority w:val="9"/>
+    <w:semiHidden/>
+    <w:rsid w:val="00273429"/>
+    <w:rPr>
+      <w:rFonts w:cstheme="majorBidi" w:eastAsiaTheme="majorEastAsia"/>
+      <w:color w:themeColor="accent1" w:themeShade="BF" w:val="2F5496"/>
+    </w:rPr>
+  </w:style>
+  <w:style w:customStyle="1" w:styleId="Heading6Char" w:type="character">
+    <w:name w:val="Heading 6 Char"/>
+    <w:basedOn w:val="DefaultParagraphFont"/>
+    <w:link w:val="Heading6"/>
+    <w:uiPriority w:val="9"/>
+    <w:semiHidden/>
+    <w:rsid w:val="00273429"/>
+    <w:rPr>
+      <w:rFonts w:cstheme="majorBidi" w:eastAsiaTheme="majorEastAsia"/>
+      <w:i/>
+      <w:iCs/>
+      <w:color w:themeColor="text1" w:themeTint="A6" w:val="595959"/>
+    </w:rPr>
+  </w:style>
+  <w:style w:customStyle="1" w:styleId="Heading7Char" w:type="character">
+    <w:name w:val="Heading 7 Char"/>
+    <w:basedOn w:val="DefaultParagraphFont"/>
+    <w:link w:val="Heading7"/>
+    <w:uiPriority w:val="9"/>
+    <w:semiHidden/>
+    <w:rsid w:val="00273429"/>
+    <w:rPr>
+      <w:rFonts w:cstheme="majorBidi" w:eastAsiaTheme="majorEastAsia"/>
+      <w:color w:themeColor="text1" w:themeTint="A6" w:val="595959"/>
+    </w:rPr>
+  </w:style>
+  <w:style w:customStyle="1" w:styleId="Heading8Char" w:type="character">
+    <w:name w:val="Heading 8 Char"/>
+    <w:basedOn w:val="DefaultParagraphFont"/>
+    <w:link w:val="Heading8"/>
+    <w:uiPriority w:val="9"/>
+    <w:semiHidden/>
+    <w:rsid w:val="00273429"/>
+    <w:rPr>
+      <w:rFonts w:cstheme="majorBidi" w:eastAsiaTheme="majorEastAsia"/>
+      <w:i/>
+      <w:iCs/>
+      <w:color w:themeColor="text1" w:themeTint="D8" w:val="272727"/>
+    </w:rPr>
+  </w:style>
+  <w:style w:customStyle="1" w:styleId="Heading9Char" w:type="character">
+    <w:name w:val="Heading 9 Char"/>
+    <w:basedOn w:val="DefaultParagraphFont"/>
+    <w:link w:val="Heading9"/>
+    <w:uiPriority w:val="9"/>
+    <w:semiHidden/>
+    <w:rsid w:val="00273429"/>
+    <w:rPr>
+      <w:rFonts w:cstheme="majorBidi" w:eastAsiaTheme="majorEastAsia"/>
+      <w:color w:themeColor="text1" w:themeTint="D8" w:val="272727"/>
+    </w:rPr>
+  </w:style>
+  <w:style w:styleId="Title" w:type="paragraph">
+    <w:name w:val="Title"/>
     <w:basedOn w:val="Normal"/>
-    <w:next w:val="Definition"/>
+    <w:next w:val="Normal"/>
+    <w:link w:val="TitleChar"/>
+    <w:uiPriority w:val="10"/>
+    <w:qFormat/>
+    <w:rsid w:val="00273429"/>
     <w:pPr>
-      <w:keepNext/>
-      <w:keepLines/>
-      <w:spacing w:after="0"/>
+      <w:spacing w:after="80" w:line="240" w:lineRule="auto"/>
+      <w:contextualSpacing/>
     </w:pPr>
     <w:rPr>
-      <w:b/>
+      <w:rFonts w:asciiTheme="majorHAnsi" w:cstheme="majorBidi" w:eastAsiaTheme="majorEastAsia" w:hAnsiTheme="majorHAnsi"/>
+      <w:spacing w:val="-10"/>
+      <w:kern w:val="28"/>
+      <w:sz w:val="56"/>
+      <w:szCs w:val="56"/>
     </w:rPr>
   </w:style>
-  <w:style w:customStyle="1" w:styleId="Definition" w:type="paragraph">
-    <w:name w:val="Definition"/>
+  <w:style w:customStyle="1" w:styleId="TitleChar" w:type="character">
+    <w:name w:val="Title Char"/>
+    <w:basedOn w:val="DefaultParagraphFont"/>
+    <w:link w:val="Title"/>
+    <w:uiPriority w:val="10"/>
+    <w:rsid w:val="00273429"/>
+    <w:rPr>
+      <w:rFonts w:asciiTheme="majorHAnsi" w:cstheme="majorBidi" w:eastAsiaTheme="majorEastAsia" w:hAnsiTheme="majorHAnsi"/>
+      <w:spacing w:val="-10"/>
+      <w:kern w:val="28"/>
+      <w:sz w:val="56"/>
+      <w:szCs w:val="56"/>
+    </w:rPr>
+  </w:style>
+  <w:style w:styleId="Subtitle" w:type="paragraph">
+    <w:name w:val="Subtitle"/>
     <w:basedOn w:val="Normal"/>
-  </w:style>
-  <w:style w:styleId="Caption" w:type="paragraph">
-    <w:name w:val="Caption"/>
+    <w:next w:val="Normal"/>
+    <w:link w:val="SubtitleChar"/>
+    <w:uiPriority w:val="11"/>
+    <w:qFormat/>
+    <w:rsid w:val="00273429"/>
+    <w:pPr>
+      <w:numPr>
+        <w:ilvl w:val="1"/>
+      </w:numPr>
+    </w:pPr>
+    <w:rPr>
+      <w:rFonts w:cstheme="majorBidi" w:eastAsiaTheme="majorEastAsia"/>
+      <w:color w:themeColor="text1" w:themeTint="A6" w:val="595959"/>
+      <w:spacing w:val="15"/>
+      <w:sz w:val="28"/>
+      <w:szCs w:val="28"/>
+    </w:rPr>
+  </w:style>
+  <w:style w:customStyle="1" w:styleId="SubtitleChar" w:type="character">
+    <w:name w:val="Subtitle Char"/>
+    <w:basedOn w:val="DefaultParagraphFont"/>
+    <w:link w:val="Subtitle"/>
+    <w:uiPriority w:val="11"/>
+    <w:rsid w:val="00273429"/>
+    <w:rPr>
+      <w:rFonts w:cstheme="majorBidi" w:eastAsiaTheme="majorEastAsia"/>
+      <w:color w:themeColor="text1" w:themeTint="A6" w:val="595959"/>
+      <w:spacing w:val="15"/>
+      <w:sz w:val="28"/>
+      <w:szCs w:val="28"/>
+    </w:rPr>
+  </w:style>
+  <w:style w:styleId="Quote" w:type="paragraph">
+    <w:name w:val="Quote"/>
     <w:basedOn w:val="Normal"/>
-    <w:link w:val="BodyTextChar"/>
+    <w:next w:val="Normal"/>
+    <w:link w:val="QuoteChar"/>
+    <w:uiPriority w:val="29"/>
+    <w:qFormat/>
+    <w:rsid w:val="00273429"/>
     <w:pPr>
-      <w:spacing w:after="120" w:before="0"/>
+      <w:spacing w:before="160"/>
+      <w:jc w:val="center"/>
     </w:pPr>
     <w:rPr>
       <w:i/>
+      <w:iCs/>
+      <w:color w:themeColor="text1" w:themeTint="BF" w:val="404040"/>
     </w:rPr>
   </w:style>
-  <w:style w:customStyle="1" w:styleId="TableCaption" w:type="paragraph">
-    <w:name w:val="Table Caption"/>
-    <w:basedOn w:val="Caption"/>
+  <w:style w:customStyle="1" w:styleId="QuoteChar" w:type="character">
+    <w:name w:val="Quote Char"/>
+    <w:basedOn w:val="DefaultParagraphFont"/>
+    <w:link w:val="Quote"/>
+    <w:uiPriority w:val="29"/>
+    <w:rsid w:val="00273429"/>
+    <w:rPr>
+      <w:i/>
+      <w:iCs/>
+      <w:color w:themeColor="text1" w:themeTint="BF" w:val="404040"/>
+    </w:rPr>
+  </w:style>
+  <w:style w:styleId="ListParagraph" w:type="paragraph">
+    <w:name w:val="List Paragraph"/>
+    <w:basedOn w:val="Normal"/>
+    <w:uiPriority w:val="34"/>
+    <w:qFormat/>
+    <w:rsid w:val="00273429"/>
     <w:pPr>
-      <w:keepNext/>
+      <w:ind w:left="720"/>
+      <w:contextualSpacing/>
     </w:pPr>
   </w:style>
-  <w:style w:customStyle="1" w:styleId="ImageCaption" w:type="paragraph">
-    <w:name w:val="Image Caption"/>
-    <w:basedOn w:val="Caption"/>
-  </w:style>
-  <w:style w:customStyle="1" w:styleId="Figure" w:type="paragraph">
-    <w:name w:val="Figure"/>
+  <w:style w:styleId="IntenseEmphasis" w:type="character">
+    <w:name w:val="Intense Emphasis"/>
+    <w:basedOn w:val="DefaultParagraphFont"/>
+    <w:uiPriority w:val="21"/>
+    <w:qFormat/>
+    <w:rsid w:val="00273429"/>
+    <w:rPr>
+      <w:i/>
+      <w:iCs/>
+      <w:color w:themeColor="accent1" w:themeShade="BF" w:val="2F5496"/>
+    </w:rPr>
+  </w:style>
+  <w:style w:styleId="IntenseQuote" w:type="paragraph">
+    <w:name w:val="Intense Quote"/>
     <w:basedOn w:val="Normal"/>
-  </w:style>
-  <w:style w:customStyle="1" w:styleId="CaptionedFigure" w:type="paragraph">
-    <w:name w:val="Captioned Figure"/>
-    <w:basedOn w:val="Figure"/>
+    <w:next w:val="Normal"/>
+    <w:link w:val="IntenseQuoteChar"/>
+    <w:uiPriority w:val="30"/>
+    <w:qFormat/>
+    <w:rsid w:val="00273429"/>
     <w:pPr>
-      <w:keepNext/>
-    </w:pPr>
-  </w:style>
-  <w:style w:customStyle="1" w:styleId="BodyTextChar" w:type="character">
-    <w:name w:val="Body Text Char"/>
-    <w:basedOn w:val="DefaultParagraphFont"/>
-    <w:link w:val="BodyText"/>
-  </w:style>
-  <w:style w:customStyle="1" w:styleId="VerbatimChar" w:type="character">
-    <w:name w:val="Verbatim Char"/>
-    <w:basedOn w:val="BodyTextChar"/>
-    <w:rPr>
-      <w:rFonts w:ascii="Consolas" w:hAnsi="Consolas"/>
-      <w:sz w:val="22"/>
-    </w:rPr>
-  </w:style>
-  <w:style w:customStyle="1" w:styleId="SectionNumber" w:type="character">
-    <w:name w:val="Section Number"/>
-    <w:basedOn w:val="BodyTextChar"/>
-  </w:style>
-  <w:style w:styleId="FootnoteReference" w:type="character">
-    <w:name w:val="Footnote Reference"/>
-    <w:basedOn w:val="BodyTextChar"/>
-    <w:rPr>
-      <w:vertAlign w:val="superscript"/>
-    </w:rPr>
-  </w:style>
-  <w:style w:styleId="Hyperlink" w:type="character">
-    <w:name w:val="Hyperlink"/>
-    <w:basedOn w:val="BodyTextChar"/>
-    <w:rPr>
-      <w:color w:themeColor="accent1" w:val="4F81BD"/>
-    </w:rPr>
-  </w:style>
-  <w:style w:styleId="TOCHeading" w:type="paragraph">
-    <w:name w:val="TOC Heading"/>
-    <w:basedOn w:val="Heading1"/>
-    <w:next w:val="BodyText"/>
-    <w:uiPriority w:val="39"/>
-    <w:unhideWhenUsed/>
-    <w:qFormat/>
-    <w:pPr>
-      <w:spacing w:before="240" w:line="259" w:lineRule="auto"/>
-      <w:outlineLvl w:val="9"/>
+      <w:pBdr>
+        <w:top w:color="2F5496" w:space="10" w:sz="4" w:themeColor="accent1" w:themeShade="BF" w:val="single"/>
+        <w:bottom w:color="2F5496" w:space="10" w:sz="4" w:themeColor="accent1" w:themeShade="BF" w:val="single"/>
+      </w:pBdr>
+      <w:spacing w:after="360" w:before="360"/>
+      <w:ind w:left="864" w:right="864"/>
+      <w:jc w:val="center"/>
     </w:pPr>
     <w:rPr>
-      <w:rFonts w:asciiTheme="majorHAnsi" w:cstheme="majorBidi" w:eastAsiaTheme="majorEastAsia" w:hAnsiTheme="majorHAnsi"/>
-      <w:b w:val="0"/>
-      <w:bCs w:val="0"/>
-      <w:color w:themeColor="accent1" w:themeShade="BF" w:val="365F91"/>
+      <w:i/>
+      <w:iCs/>
+      <w:color w:themeColor="accent1" w:themeShade="BF" w:val="2F5496"/>
     </w:rPr>
+  </w:style>
+  <w:style w:customStyle="1" w:styleId="IntenseQuoteChar" w:type="character">
+    <w:name w:val="Intense Quote Char"/>
+    <w:basedOn w:val="DefaultParagraphFont"/>
+    <w:link w:val="IntenseQuote"/>
+    <w:uiPriority w:val="30"/>
+    <w:rsid w:val="00273429"/>
+    <w:rPr>
+      <w:i/>
+      <w:iCs/>
+      <w:color w:themeColor="accent1" w:themeShade="BF" w:val="2F5496"/>
+    </w:rPr>
+  </w:style>
+  <w:style w:styleId="IntenseReference" w:type="character">
+    <w:name w:val="Intense Reference"/>
+    <w:basedOn w:val="DefaultParagraphFont"/>
+    <w:uiPriority w:val="32"/>
+    <w:qFormat/>
+    <w:rsid w:val="00273429"/>
+    <w:rPr>
+      <w:b/>
+      <w:bCs/>
+      <w:smallCaps/>
+      <w:color w:themeColor="accent1" w:themeShade="BF" w:val="2F5496"/>
+      <w:spacing w:val="5"/>
+    </w:rPr>
+  </w:style>
+  <w:style w:styleId="TableGrid" w:type="table">
+    <w:name w:val="Table Grid"/>
+    <w:basedOn w:val="TableNormal"/>
+    <w:uiPriority w:val="39"/>
+    <w:rsid w:val="00A507BF"/>
+    <w:pPr>
+      <w:spacing w:after="0" w:line="240" w:lineRule="auto"/>
+    </w:pPr>
+    <w:tblPr>
+      <w:tblBorders>
+        <w:top w:color="auto" w:space="0" w:sz="4" w:val="single"/>
+        <w:left w:color="auto" w:space="0" w:sz="4" w:val="single"/>
+        <w:bottom w:color="auto" w:space="0" w:sz="4" w:val="single"/>
+        <w:right w:color="auto" w:space="0" w:sz="4" w:val="single"/>
+        <w:insideH w:color="auto" w:space="0" w:sz="4" w:val="single"/>
+        <w:insideV w:color="auto" w:space="0" w:sz="4" w:val="single"/>
+      </w:tblBorders>
+    </w:tblPr>
   </w:style>
   <w:style w:type="paragraph" w:customStyle="1" w:styleId="SourceCode">
     <w:name w:val="Source Code"/>
@@ -4397,39 +5581,39 @@
         <a:sysClr val="window" lastClr="FFFFFF"/>
       </a:lt1>
       <a:dk2>
-        <a:srgbClr val="0E2841"/>
+        <a:srgbClr val="44546A"/>
       </a:dk2>
       <a:lt2>
-        <a:srgbClr val="E8E8E8"/>
+        <a:srgbClr val="E7E6E6"/>
       </a:lt2>
       <a:accent1>
-        <a:srgbClr val="156082"/>
+        <a:srgbClr val="4472C4"/>
       </a:accent1>
       <a:accent2>
-        <a:srgbClr val="E97132"/>
+        <a:srgbClr val="ED7D31"/>
       </a:accent2>
       <a:accent3>
-        <a:srgbClr val="196B24"/>
+        <a:srgbClr val="A5A5A5"/>
       </a:accent3>
       <a:accent4>
-        <a:srgbClr val="0F9ED5"/>
+        <a:srgbClr val="FFC000"/>
       </a:accent4>
       <a:accent5>
-        <a:srgbClr val="A02B93"/>
+        <a:srgbClr val="5B9BD5"/>
       </a:accent5>
       <a:accent6>
-        <a:srgbClr val="4EA72E"/>
+        <a:srgbClr val="70AD47"/>
       </a:accent6>
       <a:hlink>
-        <a:srgbClr val="467886"/>
+        <a:srgbClr val="0563C1"/>
       </a:hlink>
       <a:folHlink>
-        <a:srgbClr val="96607D"/>
+        <a:srgbClr val="954F72"/>
       </a:folHlink>
     </a:clrScheme>
     <a:fontScheme name="Office">
       <a:majorFont>
-        <a:latin typeface="Aptos Display" panose="02110004020202020204"/>
+        <a:latin typeface="Calibri Light" panose="020F0302020204030204"/>
         <a:ea typeface=""/>
         <a:cs typeface=""/>
         <a:font script="Jpan" typeface="游ゴシック Light"/>
@@ -4481,7 +5665,7 @@
         <a:font script="Tfng" typeface="Ebrima"/>
       </a:majorFont>
       <a:minorFont>
-        <a:latin typeface="Aptos" panose="02110004020202020204"/>
+        <a:latin typeface="Calibri" panose="020F0502020204030204"/>
         <a:ea typeface=""/>
         <a:cs typeface=""/>
         <a:font script="Jpan" typeface="游明朝"/>
@@ -4675,7 +5859,7 @@
   <a:extraClrSchemeLst/>
   <a:extLst>
     <a:ext uri="{05A4C25C-085E-4340-85A3-A5531E510DB2}">
-      <thm15:themeFamily xmlns:thm15="http://schemas.microsoft.com/office/thememl/2012/main" name="Office Theme" id="{2E142A2C-CD16-42D6-873A-C26D2A0506FA}" vid="{1BDDFF52-6CD6-40A5-AB3C-68EB2F1E4D0A}"/>
+      <thm15:themeFamily xmlns:thm15="http://schemas.microsoft.com/office/thememl/2012/main" name="Office Theme" id="{62F939B6-93AF-4DB8-9C6B-D6C7DFDC589F}" vid="{4A3C46E8-61CC-4603-A589-7422A47A8E4A}"/>
     </a:ext>
   </a:extLst>
 </a:theme>

</xml_diff>